<commit_message>
att de pdf e arquivo
</commit_message>
<xml_diff>
--- a/2_termo/BACKEND/Aulas/Aula_14/GABRIEL LÚCIO DE ARAUJO - Modelo_Relatorio_CRUD_READ_Aluno.docx
+++ b/2_termo/BACKEND/Aulas/Aula_14/GABRIEL LÚCIO DE ARAUJO - Modelo_Relatorio_CRUD_READ_Aluno.docx
@@ -26,7 +26,35 @@
         <w:rPr>
           <w:lang w:val="pt-BR"/>
         </w:rPr>
-        <w:t>CRUD — READ  |  Node.js, fs e arquivos JSON</w:t>
+        <w:t xml:space="preserve">CRUD — </w:t>
+      </w:r>
+      <w:proofErr w:type="gramStart"/>
+      <w:r>
+        <w:rPr>
+          <w:lang w:val="pt-BR"/>
+        </w:rPr>
+        <w:t>READ  |</w:t>
+      </w:r>
+      <w:proofErr w:type="gramEnd"/>
+      <w:r>
+        <w:rPr>
+          <w:lang w:val="pt-BR"/>
+        </w:rPr>
+        <w:t xml:space="preserve">  Node.js, </w:t>
+      </w:r>
+      <w:proofErr w:type="spellStart"/>
+      <w:r>
+        <w:rPr>
+          <w:lang w:val="pt-BR"/>
+        </w:rPr>
+        <w:t>fs</w:t>
+      </w:r>
+      <w:proofErr w:type="spellEnd"/>
+      <w:r>
+        <w:rPr>
+          <w:lang w:val="pt-BR"/>
+        </w:rPr>
+        <w:t xml:space="preserve"> e arquivos JSON</w:t>
       </w:r>
     </w:p>
     <w:p>
@@ -46,9 +74,11 @@
       <w:pPr>
         <w:pStyle w:val="Ttulo2"/>
       </w:pPr>
+      <w:proofErr w:type="spellStart"/>
       <w:r>
         <w:t>Identificação</w:t>
       </w:r>
+      <w:proofErr w:type="spellEnd"/>
     </w:p>
     <w:tbl>
       <w:tblPr>
@@ -195,11 +225,16 @@
               <w:cnfStyle w:val="000000000000" w:firstRow="0" w:lastRow="0" w:firstColumn="0" w:lastColumn="0" w:oddVBand="0" w:evenVBand="0" w:oddHBand="0" w:evenHBand="0" w:firstRowFirstColumn="0" w:firstRowLastColumn="0" w:lastRowFirstColumn="0" w:lastRowLastColumn="0"/>
             </w:pPr>
             <w:r>
-              <w:t xml:space="preserve">Dia 1: </w:t>
+              <w:t>Dia 1</w:t>
+            </w:r>
+            <w:proofErr w:type="gramStart"/>
+            <w:r>
+              <w:t xml:space="preserve">: </w:t>
             </w:r>
             <w:r>
               <w:t xml:space="preserve"> 20</w:t>
             </w:r>
+            <w:proofErr w:type="gramEnd"/>
             <w:r>
               <w:t>/</w:t>
             </w:r>
@@ -207,7 +242,15 @@
               <w:t>10</w:t>
             </w:r>
             <w:r>
-              <w:t>/2026   |   Dia 2: ___/___/2026</w:t>
+              <w:t>/2026   |   Dia 2: __</w:t>
+            </w:r>
+            <w:proofErr w:type="gramStart"/>
+            <w:r>
+              <w:t>_/_</w:t>
+            </w:r>
+            <w:proofErr w:type="gramEnd"/>
+            <w:r>
+              <w:t>__/2026</w:t>
             </w:r>
           </w:p>
         </w:tc>
@@ -273,7 +316,21 @@
         <w:rPr>
           <w:lang w:val="pt-BR"/>
         </w:rPr>
-        <w:t>• Desenvolva e teste o código no VS Code com Node.js; registre saídas reais do terminal.</w:t>
+        <w:t xml:space="preserve">• Desenvolva e teste o código no VS </w:t>
+      </w:r>
+      <w:proofErr w:type="spellStart"/>
+      <w:r>
+        <w:rPr>
+          <w:lang w:val="pt-BR"/>
+        </w:rPr>
+        <w:t>Code</w:t>
+      </w:r>
+      <w:proofErr w:type="spellEnd"/>
+      <w:r>
+        <w:rPr>
+          <w:lang w:val="pt-BR"/>
+        </w:rPr>
+        <w:t xml:space="preserve"> com Node.js; registre saídas reais do terminal.</w:t>
       </w:r>
     </w:p>
     <w:p>
@@ -286,7 +343,21 @@
         <w:rPr>
           <w:lang w:val="pt-BR"/>
         </w:rPr>
-        <w:t>• Use o NotebookLM e os manuais para estudar, mas não copie explicações sem compreendê-las.</w:t>
+        <w:t xml:space="preserve">• Use o </w:t>
+      </w:r>
+      <w:proofErr w:type="spellStart"/>
+      <w:r>
+        <w:rPr>
+          <w:lang w:val="pt-BR"/>
+        </w:rPr>
+        <w:t>NotebookLM</w:t>
+      </w:r>
+      <w:proofErr w:type="spellEnd"/>
+      <w:r>
+        <w:rPr>
+          <w:lang w:val="pt-BR"/>
+        </w:rPr>
+        <w:t xml:space="preserve"> e os manuais para estudar, mas não copie explicações sem compreendê-las.</w:t>
       </w:r>
     </w:p>
     <w:p>
@@ -312,7 +383,21 @@
         <w:rPr>
           <w:lang w:val="pt-BR"/>
         </w:rPr>
-        <w:t>• Entregas: Dia 1 — app.js parcial + relatório PDF; Dia 2 — projeto final ZIP (sem node_modules) + relatório PDF atualizado.</w:t>
+        <w:t xml:space="preserve">• Entregas: Dia 1 — app.js parcial + relatório PDF; Dia 2 — projeto final ZIP (sem </w:t>
+      </w:r>
+      <w:proofErr w:type="spellStart"/>
+      <w:r>
+        <w:rPr>
+          <w:lang w:val="pt-BR"/>
+        </w:rPr>
+        <w:t>node_modules</w:t>
+      </w:r>
+      <w:proofErr w:type="spellEnd"/>
+      <w:r>
+        <w:rPr>
+          <w:lang w:val="pt-BR"/>
+        </w:rPr>
+        <w:t>) + relatório PDF atualizado.</w:t>
       </w:r>
     </w:p>
     <w:p>
@@ -409,7 +494,59 @@
         <w:rPr>
           <w:lang w:val="pt-BR"/>
         </w:rPr>
-        <w:t>Referência: Manual do Aluno — Dia 1 | Conteúdos: persistência, fs.readFileSync(), JSON.parse() e forEach().</w:t>
+        <w:t xml:space="preserve">Referência: Manual do Aluno — Dia 1 | Conteúdos: persistência, </w:t>
+      </w:r>
+      <w:proofErr w:type="spellStart"/>
+      <w:proofErr w:type="gramStart"/>
+      <w:r>
+        <w:rPr>
+          <w:lang w:val="pt-BR"/>
+        </w:rPr>
+        <w:t>fs.readFileSync</w:t>
+      </w:r>
+      <w:proofErr w:type="spellEnd"/>
+      <w:proofErr w:type="gramEnd"/>
+      <w:r>
+        <w:rPr>
+          <w:lang w:val="pt-BR"/>
+        </w:rPr>
+        <w:t xml:space="preserve">(), </w:t>
+      </w:r>
+      <w:proofErr w:type="spellStart"/>
+      <w:r>
+        <w:rPr>
+          <w:lang w:val="pt-BR"/>
+        </w:rPr>
+        <w:t>JSON.parse</w:t>
+      </w:r>
+      <w:proofErr w:type="spellEnd"/>
+      <w:r>
+        <w:rPr>
+          <w:lang w:val="pt-BR"/>
+        </w:rPr>
+        <w:t xml:space="preserve">() e </w:t>
+      </w:r>
+      <w:proofErr w:type="spellStart"/>
+      <w:proofErr w:type="gramStart"/>
+      <w:r>
+        <w:rPr>
+          <w:lang w:val="pt-BR"/>
+        </w:rPr>
+        <w:t>forEach</w:t>
+      </w:r>
+      <w:proofErr w:type="spellEnd"/>
+      <w:r>
+        <w:rPr>
+          <w:lang w:val="pt-BR"/>
+        </w:rPr>
+        <w:t>(</w:t>
+      </w:r>
+      <w:proofErr w:type="gramEnd"/>
+      <w:r>
+        <w:rPr>
+          <w:lang w:val="pt-BR"/>
+        </w:rPr>
+        <w:t>).</w:t>
       </w:r>
     </w:p>
     <w:p>
@@ -443,15 +580,23 @@
     <w:p>
       <w:pPr>
         <w:rPr>
-          <w:lang w:val="pt-BR"/>
-        </w:rPr>
-      </w:pPr>
-      <w:r>
-        <w:rPr>
-          <w:color w:val="AAB1B7"/>
-          <w:lang w:val="pt-BR"/>
-        </w:rPr>
-        <w:t>__________________________________________________________________________________</w:t>
+          <w:color w:val="1F497D" w:themeColor="text2"/>
+          <w:lang w:val="pt-BR"/>
+        </w:rPr>
+      </w:pPr>
+      <w:r>
+        <w:rPr>
+          <w:color w:val="1F497D" w:themeColor="text2"/>
+          <w:lang w:val="pt-BR"/>
+        </w:rPr>
+        <w:t xml:space="preserve">Se resume em </w:t>
+      </w:r>
+      <w:r>
+        <w:rPr>
+          <w:color w:val="1F497D" w:themeColor="text2"/>
+          <w:lang w:val="pt-BR"/>
+        </w:rPr>
+        <w:t>manter os dados após a execução de m programa</w:t>
       </w:r>
     </w:p>
     <w:p>
@@ -471,15 +616,46 @@
     <w:p>
       <w:pPr>
         <w:rPr>
-          <w:lang w:val="pt-BR"/>
-        </w:rPr>
-      </w:pPr>
-      <w:r>
-        <w:rPr>
-          <w:color w:val="AAB1B7"/>
-          <w:lang w:val="pt-BR"/>
-        </w:rPr>
-        <w:t>__________________________________________________________________________________</w:t>
+          <w:color w:val="1F497D" w:themeColor="text2"/>
+          <w:lang w:val="pt-BR"/>
+        </w:rPr>
+      </w:pPr>
+      <w:r>
+        <w:rPr>
+          <w:color w:val="1F497D" w:themeColor="text2"/>
+          <w:lang w:val="pt-BR"/>
+        </w:rPr>
+        <w:t>Primeiro eu crio para depois conseguir ler</w:t>
+      </w:r>
+      <w:r>
+        <w:rPr>
+          <w:color w:val="1F497D" w:themeColor="text2"/>
+          <w:lang w:val="pt-BR"/>
+        </w:rPr>
+        <w:t xml:space="preserve">, um </w:t>
+      </w:r>
+      <w:r>
+        <w:rPr>
+          <w:color w:val="1F497D" w:themeColor="text2"/>
+          <w:lang w:val="pt-BR"/>
+        </w:rPr>
+        <w:t xml:space="preserve">faz o arquivo o outro </w:t>
+      </w:r>
+      <w:proofErr w:type="spellStart"/>
+      <w:r>
+        <w:rPr>
+          <w:color w:val="1F497D" w:themeColor="text2"/>
+          <w:lang w:val="pt-BR"/>
+        </w:rPr>
+        <w:t>encherga</w:t>
+      </w:r>
+      <w:proofErr w:type="spellEnd"/>
+      <w:r>
+        <w:rPr>
+          <w:color w:val="1F497D" w:themeColor="text2"/>
+          <w:lang w:val="pt-BR"/>
+        </w:rPr>
+        <w:t xml:space="preserve"> o arquivo.</w:t>
       </w:r>
     </w:p>
     <w:p>
@@ -493,22 +669,92 @@
           <w:b/>
           <w:lang w:val="pt-BR"/>
         </w:rPr>
-        <w:t>3. O conteúdo de um arquivo JSON é um texto ou um objeto JavaScript? Explique.</w:t>
+        <w:t xml:space="preserve">3. O conteúdo de um arquivo JSON é um texto ou um objeto </w:t>
+      </w:r>
+      <w:proofErr w:type="spellStart"/>
+      <w:r>
+        <w:rPr>
+          <w:b/>
+          <w:lang w:val="pt-BR"/>
+        </w:rPr>
+        <w:t>JavaScript</w:t>
+      </w:r>
+      <w:proofErr w:type="spellEnd"/>
+      <w:r>
+        <w:rPr>
+          <w:b/>
+          <w:lang w:val="pt-BR"/>
+        </w:rPr>
+        <w:t>? Explique.</w:t>
       </w:r>
     </w:p>
     <w:p>
       <w:pPr>
         <w:rPr>
-          <w:lang w:val="pt-BR"/>
-        </w:rPr>
-      </w:pPr>
-      <w:r>
-        <w:rPr>
-          <w:color w:val="AAB1B7"/>
-          <w:lang w:val="pt-BR"/>
-        </w:rPr>
-        <w:t>__________________________________________________________________________________</w:t>
-      </w:r>
+          <w:color w:val="1F497D" w:themeColor="text2"/>
+          <w:lang w:val="pt-BR"/>
+        </w:rPr>
+      </w:pPr>
+      <w:r>
+        <w:rPr>
+          <w:color w:val="1F497D" w:themeColor="text2"/>
+          <w:lang w:val="pt-BR"/>
+        </w:rPr>
+        <w:t xml:space="preserve">O conteúdo de um arquivo JSON é </w:t>
+      </w:r>
+      <w:r>
+        <w:rPr>
+          <w:color w:val="1F497D" w:themeColor="text2"/>
+          <w:lang w:val="pt-BR"/>
+        </w:rPr>
+        <w:t>texto sendo</w:t>
+      </w:r>
+      <w:r>
+        <w:rPr>
+          <w:color w:val="1F497D" w:themeColor="text2"/>
+          <w:lang w:val="pt-BR"/>
+        </w:rPr>
+        <w:t xml:space="preserve"> uma estrutura de objetos </w:t>
+      </w:r>
+      <w:proofErr w:type="spellStart"/>
+      <w:r>
+        <w:rPr>
+          <w:color w:val="1F497D" w:themeColor="text2"/>
+          <w:lang w:val="pt-BR"/>
+        </w:rPr>
+        <w:t>JavaScript</w:t>
+      </w:r>
+      <w:proofErr w:type="spellEnd"/>
+      <w:r>
+        <w:rPr>
+          <w:color w:val="1F497D" w:themeColor="text2"/>
+          <w:lang w:val="pt-BR"/>
+        </w:rPr>
+        <w:t xml:space="preserve"> somente em memória após ser lido e convertido pela </w:t>
+      </w:r>
+      <w:proofErr w:type="gramStart"/>
+      <w:r>
+        <w:rPr>
+          <w:color w:val="1F497D" w:themeColor="text2"/>
+          <w:lang w:val="pt-BR"/>
+        </w:rPr>
+        <w:t xml:space="preserve">função </w:t>
+      </w:r>
+      <w:r>
+        <w:rPr>
+          <w:color w:val="1F497D" w:themeColor="text2"/>
+          <w:lang w:val="pt-BR"/>
+        </w:rPr>
+        <w:t>.p</w:t>
+      </w:r>
+      <w:r>
+        <w:rPr>
+          <w:color w:val="1F497D" w:themeColor="text2"/>
+          <w:lang w:val="pt-BR"/>
+        </w:rPr>
+        <w:t>arse</w:t>
+      </w:r>
+      <w:proofErr w:type="gramEnd"/>
     </w:p>
     <w:p>
       <w:pPr>
@@ -521,21 +767,90 @@
           <w:b/>
           <w:lang w:val="pt-BR"/>
         </w:rPr>
-        <w:t>4. Quantos registros existem em maquinas.json? Como você confirmou?</w:t>
+        <w:t xml:space="preserve">4. Quantos registros existem em </w:t>
+      </w:r>
+      <w:proofErr w:type="spellStart"/>
+      <w:proofErr w:type="gramStart"/>
+      <w:r>
+        <w:rPr>
+          <w:b/>
+          <w:lang w:val="pt-BR"/>
+        </w:rPr>
+        <w:t>maquinas.json</w:t>
+      </w:r>
+      <w:proofErr w:type="spellEnd"/>
+      <w:proofErr w:type="gramEnd"/>
+      <w:r>
+        <w:rPr>
+          <w:b/>
+          <w:lang w:val="pt-BR"/>
+        </w:rPr>
+        <w:t>? Como você confirmou?</w:t>
       </w:r>
     </w:p>
     <w:p>
       <w:pPr>
         <w:rPr>
-          <w:lang w:val="pt-BR"/>
-        </w:rPr>
-      </w:pPr>
-      <w:r>
-        <w:rPr>
-          <w:color w:val="AAB1B7"/>
-          <w:lang w:val="pt-BR"/>
-        </w:rPr>
-        <w:t>__________________________________________________________________________________</w:t>
+          <w:color w:val="1F497D" w:themeColor="text2"/>
+          <w:lang w:val="pt-BR"/>
+        </w:rPr>
+      </w:pPr>
+      <w:r>
+        <w:rPr>
+          <w:color w:val="1F497D" w:themeColor="text2"/>
+          <w:lang w:val="pt-BR"/>
+        </w:rPr>
+        <w:t xml:space="preserve">8, de duas maneiras, abrindo o </w:t>
+      </w:r>
+      <w:proofErr w:type="spellStart"/>
+      <w:proofErr w:type="gramStart"/>
+      <w:r>
+        <w:rPr>
+          <w:color w:val="1F497D" w:themeColor="text2"/>
+          <w:lang w:val="pt-BR"/>
+        </w:rPr>
+        <w:t>maquinas.json</w:t>
+      </w:r>
+      <w:proofErr w:type="spellEnd"/>
+      <w:proofErr w:type="gramEnd"/>
+      <w:r>
+        <w:rPr>
+          <w:color w:val="1F497D" w:themeColor="text2"/>
+          <w:lang w:val="pt-BR"/>
+        </w:rPr>
+        <w:t xml:space="preserve"> ou </w:t>
+      </w:r>
+      <w:proofErr w:type="spellStart"/>
+      <w:r>
+        <w:rPr>
+          <w:color w:val="1F497D" w:themeColor="text2"/>
+          <w:lang w:val="pt-BR"/>
+        </w:rPr>
+        <w:t>executanto</w:t>
+      </w:r>
+      <w:proofErr w:type="spellEnd"/>
+      <w:r>
+        <w:rPr>
+          <w:color w:val="1F497D" w:themeColor="text2"/>
+          <w:lang w:val="pt-BR"/>
+        </w:rPr>
+        <w:t xml:space="preserve"> no app.js uma leitura de quantos elementos tem </w:t>
+      </w:r>
+      <w:proofErr w:type="spellStart"/>
+      <w:r>
+        <w:rPr>
+          <w:color w:val="1F497D" w:themeColor="text2"/>
+          <w:lang w:val="pt-BR"/>
+        </w:rPr>
+        <w:t>la</w:t>
+      </w:r>
+      <w:proofErr w:type="spellEnd"/>
+      <w:r>
+        <w:rPr>
+          <w:color w:val="1F497D" w:themeColor="text2"/>
+          <w:lang w:val="pt-BR"/>
+        </w:rPr>
+        <w:t xml:space="preserve"> (objetos)</w:t>
       </w:r>
     </w:p>
     <w:p>
@@ -555,15 +870,16 @@
     <w:p>
       <w:pPr>
         <w:rPr>
-          <w:lang w:val="pt-BR"/>
-        </w:rPr>
-      </w:pPr>
-      <w:r>
-        <w:rPr>
-          <w:color w:val="AAB1B7"/>
-          <w:lang w:val="pt-BR"/>
-        </w:rPr>
-        <w:t>__________________________________________________________________________________</w:t>
+          <w:color w:val="1F497D" w:themeColor="text2"/>
+          <w:lang w:val="pt-BR"/>
+        </w:rPr>
+      </w:pPr>
+      <w:r>
+        <w:rPr>
+          <w:color w:val="1F497D" w:themeColor="text2"/>
+          <w:lang w:val="pt-BR"/>
+        </w:rPr>
+        <w:t>Para ter uma diferenciação clara entre os objetos para caso de consulta e ou alteração</w:t>
       </w:r>
     </w:p>
     <w:p>
@@ -583,6 +899,7 @@
     <w:p>
       <w:pPr>
         <w:rPr>
+          <w:b/>
           <w:lang w:val="pt-BR"/>
         </w:rPr>
       </w:pPr>
@@ -597,29 +914,126 @@
     <w:p>
       <w:pPr>
         <w:rPr>
-          <w:lang w:val="pt-BR"/>
-        </w:rPr>
-      </w:pPr>
-      <w:r>
-        <w:rPr>
-          <w:color w:val="AAB1B7"/>
-          <w:lang w:val="pt-BR"/>
-        </w:rPr>
-        <w:t>__________________________________________________________________________________</w:t>
+          <w:color w:val="1F497D" w:themeColor="text2"/>
+          <w:lang w:val="pt-BR"/>
+        </w:rPr>
+      </w:pPr>
+      <w:r>
+        <w:rPr>
+          <w:color w:val="1F497D" w:themeColor="text2"/>
+          <w:lang w:val="pt-BR"/>
+        </w:rPr>
+        <w:t>    "id</w:t>
+      </w:r>
+      <w:proofErr w:type="gramStart"/>
+      <w:r>
+        <w:rPr>
+          <w:color w:val="1F497D" w:themeColor="text2"/>
+          <w:lang w:val="pt-BR"/>
+        </w:rPr>
+        <w:t>"</w:t>
+      </w:r>
+      <w:r>
+        <w:rPr>
+          <w:color w:val="1F497D" w:themeColor="text2"/>
+          <w:lang w:val="pt-BR"/>
+        </w:rPr>
+        <w:t xml:space="preserve">, </w:t>
+      </w:r>
+      <w:r>
+        <w:rPr>
+          <w:color w:val="1F497D" w:themeColor="text2"/>
+          <w:lang w:val="pt-BR"/>
+        </w:rPr>
+        <w:t xml:space="preserve"> "</w:t>
+      </w:r>
+      <w:proofErr w:type="gramEnd"/>
+      <w:r>
+        <w:rPr>
+          <w:color w:val="1F497D" w:themeColor="text2"/>
+          <w:lang w:val="pt-BR"/>
+        </w:rPr>
+        <w:t>nome"</w:t>
+      </w:r>
+      <w:r>
+        <w:rPr>
+          <w:color w:val="1F497D" w:themeColor="text2"/>
+          <w:lang w:val="pt-BR"/>
+        </w:rPr>
+        <w:t>,</w:t>
+      </w:r>
+      <w:r>
+        <w:rPr>
+          <w:color w:val="1F497D" w:themeColor="text2"/>
+          <w:lang w:val="pt-BR"/>
+        </w:rPr>
+        <w:t xml:space="preserve"> </w:t>
+      </w:r>
+      <w:r>
+        <w:rPr>
+          <w:color w:val="1F497D" w:themeColor="text2"/>
+          <w:lang w:val="pt-BR"/>
+        </w:rPr>
+        <w:t>"setor"</w:t>
+      </w:r>
+      <w:proofErr w:type="gramStart"/>
+      <w:r>
+        <w:rPr>
+          <w:color w:val="1F497D" w:themeColor="text2"/>
+          <w:lang w:val="pt-BR"/>
+        </w:rPr>
+        <w:t>,</w:t>
+      </w:r>
+      <w:r>
+        <w:rPr>
+          <w:color w:val="1F497D" w:themeColor="text2"/>
+          <w:lang w:val="pt-BR"/>
+        </w:rPr>
+        <w:t xml:space="preserve"> </w:t>
+      </w:r>
+      <w:r>
+        <w:rPr>
+          <w:color w:val="1F497D" w:themeColor="text2"/>
+          <w:lang w:val="pt-BR"/>
+        </w:rPr>
+        <w:t>”status</w:t>
+      </w:r>
+      <w:proofErr w:type="gramEnd"/>
+      <w:r>
+        <w:rPr>
+          <w:color w:val="1F497D" w:themeColor="text2"/>
+          <w:lang w:val="pt-BR"/>
+        </w:rPr>
+        <w:t xml:space="preserve">”, </w:t>
+      </w:r>
+      <w:r>
+        <w:rPr>
+          <w:color w:val="1F497D" w:themeColor="text2"/>
+          <w:lang w:val="pt-BR"/>
+        </w:rPr>
+        <w:t xml:space="preserve">“horas de uso”; </w:t>
       </w:r>
     </w:p>
     <w:p>
       <w:pPr>
         <w:rPr>
-          <w:lang w:val="pt-BR"/>
-        </w:rPr>
-      </w:pPr>
-      <w:r>
-        <w:rPr>
-          <w:color w:val="AAB1B7"/>
-          <w:lang w:val="pt-BR"/>
-        </w:rPr>
-        <w:t>__________________________________________________________________________________</w:t>
+          <w:color w:val="1F497D" w:themeColor="text2"/>
+          <w:lang w:val="pt-BR"/>
+        </w:rPr>
+      </w:pPr>
+      <w:r>
+        <w:rPr>
+          <w:color w:val="1F497D" w:themeColor="text2"/>
+          <w:lang w:val="pt-BR"/>
+        </w:rPr>
+        <w:t xml:space="preserve">2, </w:t>
+      </w:r>
+      <w:r>
+        <w:rPr>
+          <w:color w:val="1F497D" w:themeColor="text2"/>
+          <w:lang w:val="pt-BR"/>
+        </w:rPr>
+        <w:t>Mesa de corte, Corte, operando, 480</w:t>
       </w:r>
     </w:p>
     <w:p>
@@ -628,68 +1042,187 @@
           <w:lang w:val="pt-BR"/>
         </w:rPr>
       </w:pPr>
-      <w:r>
-        <w:rPr>
-          <w:b/>
-          <w:lang w:val="pt-BR"/>
-        </w:rPr>
-        <w:t>7. Por que utilizamos JSON.parse() depois de ler o arquivo com utf8?</w:t>
-      </w:r>
     </w:p>
     <w:p>
       <w:pPr>
         <w:rPr>
-          <w:lang w:val="pt-BR"/>
-        </w:rPr>
-      </w:pPr>
-      <w:r>
-        <w:rPr>
-          <w:color w:val="AAB1B7"/>
-          <w:lang w:val="pt-BR"/>
-        </w:rPr>
-        <w:t>__________________________________________________________________________________</w:t>
+          <w:b/>
+          <w:lang w:val="pt-BR"/>
+        </w:rPr>
+      </w:pPr>
+      <w:r>
+        <w:rPr>
+          <w:b/>
+          <w:lang w:val="pt-BR"/>
+        </w:rPr>
+        <w:t xml:space="preserve">7. Por que utilizamos </w:t>
+      </w:r>
+      <w:proofErr w:type="spellStart"/>
+      <w:r>
+        <w:rPr>
+          <w:b/>
+          <w:lang w:val="pt-BR"/>
+        </w:rPr>
+        <w:t>JSON.parse</w:t>
+      </w:r>
+      <w:proofErr w:type="spellEnd"/>
+      <w:r>
+        <w:rPr>
+          <w:b/>
+          <w:lang w:val="pt-BR"/>
+        </w:rPr>
+        <w:t>() depois de ler o arquivo com utf8?</w:t>
       </w:r>
     </w:p>
     <w:p>
       <w:pPr>
         <w:rPr>
-          <w:lang w:val="pt-BR"/>
-        </w:rPr>
-      </w:pPr>
-      <w:r>
-        <w:rPr>
-          <w:color w:val="AAB1B7"/>
-          <w:lang w:val="pt-BR"/>
-        </w:rPr>
-        <w:t>__________________________________________________________________________________</w:t>
+          <w:color w:val="1F497D" w:themeColor="text2"/>
+          <w:lang w:val="pt-BR"/>
+        </w:rPr>
+      </w:pPr>
+      <w:proofErr w:type="gramStart"/>
+      <w:r>
+        <w:rPr>
+          <w:b/>
+          <w:color w:val="1F497D" w:themeColor="text2"/>
+          <w:lang w:val="pt-BR"/>
+        </w:rPr>
+        <w:t>.parse</w:t>
+      </w:r>
+      <w:proofErr w:type="gramEnd"/>
+      <w:r>
+        <w:rPr>
+          <w:b/>
+          <w:color w:val="1F497D" w:themeColor="text2"/>
+          <w:lang w:val="pt-BR"/>
+        </w:rPr>
+        <w:t xml:space="preserve"> transforma em objeto para </w:t>
+      </w:r>
+      <w:proofErr w:type="spellStart"/>
+      <w:r>
+        <w:rPr>
+          <w:b/>
+          <w:color w:val="1F497D" w:themeColor="text2"/>
+          <w:lang w:val="pt-BR"/>
+        </w:rPr>
+        <w:t>javaScript</w:t>
+      </w:r>
+      <w:proofErr w:type="spellEnd"/>
+      <w:r>
+        <w:rPr>
+          <w:b/>
+          <w:color w:val="1F497D" w:themeColor="text2"/>
+          <w:lang w:val="pt-BR"/>
+        </w:rPr>
+        <w:t xml:space="preserve">, utf8 transforma tudo em texto </w:t>
+      </w:r>
+      <w:r>
+        <w:rPr>
+          <w:b/>
+          <w:color w:val="1F497D" w:themeColor="text2"/>
+          <w:lang w:val="pt-BR"/>
+        </w:rPr>
+        <w:t>legível.</w:t>
       </w:r>
     </w:p>
     <w:p>
       <w:pPr>
         <w:rPr>
-          <w:lang w:val="pt-BR"/>
-        </w:rPr>
-      </w:pPr>
-      <w:r>
-        <w:rPr>
           <w:b/>
           <w:lang w:val="pt-BR"/>
         </w:rPr>
-        <w:t>8. Por que o valor lido como string não pode ser percorrido diretamente como um array de máquinas?</w:t>
+      </w:pPr>
+      <w:r>
+        <w:rPr>
+          <w:b/>
+          <w:lang w:val="pt-BR"/>
+        </w:rPr>
+        <w:t xml:space="preserve">8. Por que o valor lido como </w:t>
+      </w:r>
+      <w:proofErr w:type="spellStart"/>
+      <w:r>
+        <w:rPr>
+          <w:b/>
+          <w:lang w:val="pt-BR"/>
+        </w:rPr>
+        <w:t>string</w:t>
+      </w:r>
+      <w:proofErr w:type="spellEnd"/>
+      <w:r>
+        <w:rPr>
+          <w:b/>
+          <w:lang w:val="pt-BR"/>
+        </w:rPr>
+        <w:t xml:space="preserve"> não pode ser percorrido diretamente como um </w:t>
+      </w:r>
+      <w:proofErr w:type="spellStart"/>
+      <w:r>
+        <w:rPr>
+          <w:b/>
+          <w:lang w:val="pt-BR"/>
+        </w:rPr>
+        <w:t>array</w:t>
+      </w:r>
+      <w:proofErr w:type="spellEnd"/>
+      <w:r>
+        <w:rPr>
+          <w:b/>
+          <w:lang w:val="pt-BR"/>
+        </w:rPr>
+        <w:t xml:space="preserve"> de máquinas?</w:t>
       </w:r>
     </w:p>
     <w:p>
       <w:pPr>
         <w:rPr>
-          <w:lang w:val="pt-BR"/>
-        </w:rPr>
-      </w:pPr>
-      <w:r>
-        <w:rPr>
-          <w:color w:val="AAB1B7"/>
-          <w:lang w:val="pt-BR"/>
-        </w:rPr>
-        <w:t>__________________________________________________________________________________</w:t>
+          <w:color w:val="1F497D" w:themeColor="text2"/>
+          <w:lang w:val="pt-BR"/>
+        </w:rPr>
+      </w:pPr>
+      <w:r>
+        <w:rPr>
+          <w:color w:val="1F497D" w:themeColor="text2"/>
+          <w:lang w:val="pt-BR"/>
+        </w:rPr>
+        <w:t xml:space="preserve">A </w:t>
+      </w:r>
+      <w:proofErr w:type="spellStart"/>
+      <w:r>
+        <w:rPr>
+          <w:color w:val="1F497D" w:themeColor="text2"/>
+          <w:lang w:val="pt-BR"/>
+        </w:rPr>
+        <w:t>string</w:t>
+      </w:r>
+      <w:proofErr w:type="spellEnd"/>
+      <w:r>
+        <w:rPr>
+          <w:color w:val="1F497D" w:themeColor="text2"/>
+          <w:lang w:val="pt-BR"/>
+        </w:rPr>
+        <w:t xml:space="preserve"> lida representa apenas texto puro</w:t>
+      </w:r>
+      <w:r>
+        <w:rPr>
+          <w:color w:val="1F497D" w:themeColor="text2"/>
+          <w:lang w:val="pt-BR"/>
+        </w:rPr>
+        <w:t xml:space="preserve">, </w:t>
+      </w:r>
+      <w:r>
+        <w:rPr>
+          <w:color w:val="1F497D" w:themeColor="text2"/>
+          <w:lang w:val="pt-BR"/>
+        </w:rPr>
+        <w:t>permitindo navegar somente por caracteres individuais</w:t>
+      </w:r>
+      <w:r>
+        <w:rPr>
+          <w:color w:val="1F497D" w:themeColor="text2"/>
+          <w:lang w:val="pt-BR"/>
+        </w:rPr>
+        <w:t>.</w:t>
       </w:r>
     </w:p>
     <w:p>
@@ -698,13 +1231,6 @@
           <w:lang w:val="pt-BR"/>
         </w:rPr>
       </w:pPr>
-      <w:r>
-        <w:rPr>
-          <w:color w:val="AAB1B7"/>
-          <w:lang w:val="pt-BR"/>
-        </w:rPr>
-        <w:t>__________________________________________________________________________________</w:t>
-      </w:r>
     </w:p>
     <w:p>
       <w:pPr>
@@ -759,21 +1285,111 @@
           <w:b/>
           <w:lang w:val="pt-BR"/>
         </w:rPr>
-        <w:t>9. Descreva o que faz carregarMaquinas(): leitura do arquivo, conversão e retorno.</w:t>
+        <w:t xml:space="preserve">9. Descreva o que faz </w:t>
+      </w:r>
+      <w:proofErr w:type="spellStart"/>
+      <w:proofErr w:type="gramStart"/>
+      <w:r>
+        <w:rPr>
+          <w:b/>
+          <w:lang w:val="pt-BR"/>
+        </w:rPr>
+        <w:t>carregarMaquinas</w:t>
+      </w:r>
+      <w:proofErr w:type="spellEnd"/>
+      <w:r>
+        <w:rPr>
+          <w:b/>
+          <w:lang w:val="pt-BR"/>
+        </w:rPr>
+        <w:t>(</w:t>
+      </w:r>
+      <w:proofErr w:type="gramEnd"/>
+      <w:r>
+        <w:rPr>
+          <w:b/>
+          <w:lang w:val="pt-BR"/>
+        </w:rPr>
+        <w:t>): leitura do arquivo, conversão e retorno.</w:t>
       </w:r>
     </w:p>
     <w:p>
       <w:pPr>
         <w:rPr>
-          <w:lang w:val="pt-BR"/>
-        </w:rPr>
-      </w:pPr>
-      <w:r>
-        <w:rPr>
-          <w:color w:val="AAB1B7"/>
-          <w:lang w:val="pt-BR"/>
-        </w:rPr>
-        <w:t>__________________________________________________________________________________</w:t>
+          <w:color w:val="1F497D" w:themeColor="text2"/>
+          <w:lang w:val="pt-BR"/>
+        </w:rPr>
+      </w:pPr>
+      <w:r>
+        <w:rPr>
+          <w:color w:val="1F497D" w:themeColor="text2"/>
+          <w:lang w:val="pt-BR"/>
+        </w:rPr>
+        <w:t>É</w:t>
+      </w:r>
+      <w:r>
+        <w:rPr>
+          <w:color w:val="1F497D" w:themeColor="text2"/>
+          <w:lang w:val="pt-BR"/>
+        </w:rPr>
+        <w:t xml:space="preserve"> a principal </w:t>
+      </w:r>
+      <w:proofErr w:type="spellStart"/>
+      <w:r>
+        <w:rPr>
+          <w:color w:val="1F497D" w:themeColor="text2"/>
+          <w:lang w:val="pt-BR"/>
+        </w:rPr>
+        <w:t>funtion</w:t>
+      </w:r>
+      <w:proofErr w:type="spellEnd"/>
+      <w:r>
+        <w:rPr>
+          <w:color w:val="1F497D" w:themeColor="text2"/>
+          <w:lang w:val="pt-BR"/>
+        </w:rPr>
+        <w:t xml:space="preserve"> para todos funcionar, ela que importa o </w:t>
+      </w:r>
+      <w:proofErr w:type="spellStart"/>
+      <w:r>
+        <w:rPr>
+          <w:color w:val="1F497D" w:themeColor="text2"/>
+          <w:lang w:val="pt-BR"/>
+        </w:rPr>
+        <w:t>json</w:t>
+      </w:r>
+      <w:proofErr w:type="spellEnd"/>
+      <w:r>
+        <w:rPr>
+          <w:color w:val="1F497D" w:themeColor="text2"/>
+          <w:lang w:val="pt-BR"/>
+        </w:rPr>
+        <w:t xml:space="preserve"> e </w:t>
+      </w:r>
+      <w:r>
+        <w:rPr>
+          <w:color w:val="1F497D" w:themeColor="text2"/>
+          <w:lang w:val="pt-BR"/>
+        </w:rPr>
+        <w:t xml:space="preserve">converte em texto e em utf-8, e retorna tudo que </w:t>
+      </w:r>
+      <w:proofErr w:type="spellStart"/>
+      <w:proofErr w:type="gramStart"/>
+      <w:r>
+        <w:rPr>
+          <w:color w:val="1F497D" w:themeColor="text2"/>
+          <w:lang w:val="pt-BR"/>
+        </w:rPr>
+        <w:t>esta</w:t>
+      </w:r>
+      <w:proofErr w:type="spellEnd"/>
+      <w:proofErr w:type="gramEnd"/>
+      <w:r>
+        <w:rPr>
+          <w:color w:val="1F497D" w:themeColor="text2"/>
+          <w:lang w:val="pt-BR"/>
+        </w:rPr>
+        <w:t xml:space="preserve"> lá.</w:t>
       </w:r>
     </w:p>
     <w:p>
@@ -784,80 +1400,114 @@
       </w:pPr>
       <w:r>
         <w:rPr>
-          <w:color w:val="AAB1B7"/>
-          <w:lang w:val="pt-BR"/>
-        </w:rPr>
-        <w:t>__________________________________________________________________________________</w:t>
+          <w:b/>
+          <w:lang w:val="pt-BR"/>
+        </w:rPr>
+        <w:t xml:space="preserve">10. Explique como </w:t>
+      </w:r>
+      <w:proofErr w:type="spellStart"/>
+      <w:proofErr w:type="gramStart"/>
+      <w:r>
+        <w:rPr>
+          <w:b/>
+          <w:lang w:val="pt-BR"/>
+        </w:rPr>
+        <w:t>listarMaquinas</w:t>
+      </w:r>
+      <w:proofErr w:type="spellEnd"/>
+      <w:r>
+        <w:rPr>
+          <w:b/>
+          <w:lang w:val="pt-BR"/>
+        </w:rPr>
+        <w:t>(</w:t>
+      </w:r>
+      <w:proofErr w:type="gramEnd"/>
+      <w:r>
+        <w:rPr>
+          <w:b/>
+          <w:lang w:val="pt-BR"/>
+        </w:rPr>
+        <w:t xml:space="preserve">) utiliza </w:t>
+      </w:r>
+      <w:proofErr w:type="spellStart"/>
+      <w:proofErr w:type="gramStart"/>
+      <w:r>
+        <w:rPr>
+          <w:b/>
+          <w:lang w:val="pt-BR"/>
+        </w:rPr>
+        <w:t>forEach</w:t>
+      </w:r>
+      <w:proofErr w:type="spellEnd"/>
+      <w:r>
+        <w:rPr>
+          <w:b/>
+          <w:lang w:val="pt-BR"/>
+        </w:rPr>
+        <w:t>(</w:t>
+      </w:r>
+      <w:proofErr w:type="gramEnd"/>
+      <w:r>
+        <w:rPr>
+          <w:b/>
+          <w:lang w:val="pt-BR"/>
+        </w:rPr>
+        <w:t>) para exibir os registros.</w:t>
       </w:r>
     </w:p>
     <w:p>
       <w:pPr>
         <w:rPr>
-          <w:lang w:val="pt-BR"/>
-        </w:rPr>
-      </w:pPr>
-      <w:r>
-        <w:rPr>
-          <w:color w:val="AAB1B7"/>
-          <w:lang w:val="pt-BR"/>
-        </w:rPr>
-        <w:t>__________________________________________________________________________________</w:t>
-      </w:r>
-    </w:p>
-    <w:p>
-      <w:pPr>
-        <w:rPr>
-          <w:lang w:val="pt-BR"/>
-        </w:rPr>
-      </w:pPr>
-      <w:r>
-        <w:rPr>
-          <w:b/>
-          <w:lang w:val="pt-BR"/>
-        </w:rPr>
-        <w:t>10. Explique como listarMaquinas() utiliza forEach() para exibir os registros.</w:t>
-      </w:r>
-    </w:p>
-    <w:p>
-      <w:pPr>
-        <w:rPr>
-          <w:lang w:val="pt-BR"/>
-        </w:rPr>
-      </w:pPr>
-      <w:r>
-        <w:rPr>
-          <w:color w:val="AAB1B7"/>
-          <w:lang w:val="pt-BR"/>
-        </w:rPr>
-        <w:t>__________________________________________________________________________________</w:t>
-      </w:r>
-    </w:p>
-    <w:p>
-      <w:pPr>
-        <w:rPr>
-          <w:lang w:val="pt-BR"/>
-        </w:rPr>
-      </w:pPr>
-      <w:r>
-        <w:rPr>
-          <w:color w:val="AAB1B7"/>
-          <w:lang w:val="pt-BR"/>
-        </w:rPr>
-        <w:t>__________________________________________________________________________________</w:t>
-      </w:r>
-    </w:p>
-    <w:p>
-      <w:pPr>
-        <w:rPr>
-          <w:lang w:val="pt-BR"/>
-        </w:rPr>
-      </w:pPr>
-      <w:r>
-        <w:rPr>
-          <w:color w:val="AAB1B7"/>
-          <w:lang w:val="pt-BR"/>
-        </w:rPr>
-        <w:t>__________________________________________________________________________________</w:t>
+          <w:color w:val="1F497D" w:themeColor="text2"/>
+          <w:lang w:val="pt-BR"/>
+        </w:rPr>
+      </w:pPr>
+      <w:r>
+        <w:rPr>
+          <w:color w:val="1F497D" w:themeColor="text2"/>
+          <w:lang w:val="pt-BR"/>
+        </w:rPr>
+        <w:t xml:space="preserve">Ele usa o </w:t>
+      </w:r>
+      <w:proofErr w:type="spellStart"/>
+      <w:r>
+        <w:rPr>
+          <w:color w:val="1F497D" w:themeColor="text2"/>
+          <w:lang w:val="pt-BR"/>
+        </w:rPr>
+        <w:t>forEach</w:t>
+      </w:r>
+      <w:proofErr w:type="spellEnd"/>
+      <w:r>
+        <w:rPr>
+          <w:color w:val="1F497D" w:themeColor="text2"/>
+          <w:lang w:val="pt-BR"/>
+        </w:rPr>
+        <w:t xml:space="preserve">, que é basicamente um for, uma repetição como no </w:t>
+      </w:r>
+      <w:proofErr w:type="spellStart"/>
+      <w:r>
+        <w:rPr>
+          <w:color w:val="1F497D" w:themeColor="text2"/>
+          <w:lang w:val="pt-BR"/>
+        </w:rPr>
+        <w:t>while</w:t>
+      </w:r>
+      <w:proofErr w:type="spellEnd"/>
+      <w:r>
+        <w:rPr>
+          <w:color w:val="1F497D" w:themeColor="text2"/>
+          <w:lang w:val="pt-BR"/>
+        </w:rPr>
+        <w:t xml:space="preserve">, </w:t>
+      </w:r>
+      <w:r>
+        <w:rPr>
+          <w:color w:val="1F497D" w:themeColor="text2"/>
+          <w:lang w:val="pt-BR"/>
+        </w:rPr>
+        <w:t>ele utiliza para não ter que escrever manualmente cada linha e melhora quando eu não sei exatamente a quantidade de objetos.</w:t>
       </w:r>
     </w:p>
     <w:p>
@@ -895,9 +1545,12 @@
         <w:tblLook w:val="04A0" w:firstRow="1" w:lastRow="0" w:firstColumn="1" w:lastColumn="0" w:noHBand="0" w:noVBand="1"/>
       </w:tblPr>
       <w:tblGrid>
-        <w:gridCol w:w="9773"/>
+        <w:gridCol w:w="9989"/>
       </w:tblGrid>
       <w:tr>
+        <w:trPr>
+          <w:trHeight w:val="1553"/>
+        </w:trPr>
         <w:tc>
           <w:tcPr>
             <w:tcW w:w="9773" w:type="dxa"/>
@@ -910,49 +1563,56 @@
             </w:pPr>
             <w:r>
               <w:rPr>
-                <w:color w:val="7D7D7D"/>
-                <w:lang w:val="pt-BR"/>
+                <w:noProof/>
               </w:rPr>
-              <w:t>COLE AQUI A CAPTURA DE TELA DO TERMINAL / CÓDIGO (substitua este texto pela imagem).</w:t>
-            </w:r>
-          </w:p>
-          <w:p>
-            <w:pPr>
-              <w:rPr>
-                <w:lang w:val="pt-BR"/>
-              </w:rPr>
-            </w:pPr>
-            <w:r>
-              <w:rPr>
-                <w:lang w:val="pt-BR"/>
-              </w:rPr>
-              <w:t xml:space="preserve"> </w:t>
-            </w:r>
-          </w:p>
-          <w:p>
-            <w:pPr>
-              <w:rPr>
-                <w:lang w:val="pt-BR"/>
-              </w:rPr>
-            </w:pPr>
-            <w:r>
-              <w:rPr>
-                <w:lang w:val="pt-BR"/>
-              </w:rPr>
-              <w:t xml:space="preserve"> </w:t>
-            </w:r>
-          </w:p>
-          <w:p>
-            <w:pPr>
-              <w:rPr>
-                <w:lang w:val="pt-BR"/>
-              </w:rPr>
-            </w:pPr>
-            <w:r>
-              <w:rPr>
-                <w:lang w:val="pt-BR"/>
-              </w:rPr>
-              <w:t xml:space="preserve"> </w:t>
+              <w:drawing>
+                <wp:inline distT="0" distB="0" distL="0" distR="0" wp14:anchorId="11193275" wp14:editId="050C82C6">
+                  <wp:extent cx="6205855" cy="904240"/>
+                  <wp:effectExtent l="0" t="0" r="4445" b="0"/>
+                  <wp:docPr id="1648270785" name="Imagem 1"/>
+                  <wp:cNvGraphicFramePr>
+                    <a:graphicFrameLocks xmlns:a="http://schemas.openxmlformats.org/drawingml/2006/main" noChangeAspect="1"/>
+                  </wp:cNvGraphicFramePr>
+                  <a:graphic xmlns:a="http://schemas.openxmlformats.org/drawingml/2006/main">
+                    <a:graphicData uri="http://schemas.openxmlformats.org/drawingml/2006/picture">
+                      <pic:pic xmlns:pic="http://schemas.openxmlformats.org/drawingml/2006/picture">
+                        <pic:nvPicPr>
+                          <pic:cNvPr id="0" name="Picture 1"/>
+                          <pic:cNvPicPr>
+                            <a:picLocks noChangeAspect="1" noChangeArrowheads="1"/>
+                          </pic:cNvPicPr>
+                        </pic:nvPicPr>
+                        <pic:blipFill>
+                          <a:blip r:embed="rId8">
+                            <a:extLst>
+                              <a:ext uri="{28A0092B-C50C-407E-A947-70E740481C1C}">
+                                <a14:useLocalDpi xmlns:a14="http://schemas.microsoft.com/office/drawing/2010/main" val="0"/>
+                              </a:ext>
+                            </a:extLst>
+                          </a:blip>
+                          <a:srcRect/>
+                          <a:stretch>
+                            <a:fillRect/>
+                          </a:stretch>
+                        </pic:blipFill>
+                        <pic:spPr bwMode="auto">
+                          <a:xfrm>
+                            <a:off x="0" y="0"/>
+                            <a:ext cx="6205855" cy="904240"/>
+                          </a:xfrm>
+                          <a:prstGeom prst="rect">
+                            <a:avLst/>
+                          </a:prstGeom>
+                          <a:noFill/>
+                          <a:ln>
+                            <a:noFill/>
+                          </a:ln>
+                        </pic:spPr>
+                      </pic:pic>
+                    </a:graphicData>
+                  </a:graphic>
+                </wp:inline>
+              </w:drawing>
             </w:r>
           </w:p>
         </w:tc>
@@ -975,29 +1635,30 @@
     <w:p>
       <w:pPr>
         <w:rPr>
-          <w:lang w:val="pt-BR"/>
-        </w:rPr>
-      </w:pPr>
-      <w:r>
-        <w:rPr>
-          <w:color w:val="AAB1B7"/>
-          <w:lang w:val="pt-BR"/>
-        </w:rPr>
-        <w:t>__________________________________________________________________________________</w:t>
+          <w:color w:val="1F497D" w:themeColor="text2"/>
+          <w:lang w:val="pt-BR"/>
+        </w:rPr>
+      </w:pPr>
+      <w:r>
+        <w:rPr>
+          <w:color w:val="1F497D" w:themeColor="text2"/>
+          <w:lang w:val="pt-BR"/>
+        </w:rPr>
+        <w:t>Sim.</w:t>
       </w:r>
     </w:p>
     <w:p>
       <w:pPr>
-        <w:rPr>
-          <w:lang w:val="pt-BR"/>
-        </w:rPr>
-      </w:pPr>
-      <w:r>
-        <w:rPr>
-          <w:color w:val="AAB1B7"/>
-          <w:lang w:val="pt-BR"/>
-        </w:rPr>
-        <w:t>__________________________________________________________________________________</w:t>
+        <w:pStyle w:val="Ttulo1"/>
+        <w:rPr>
+          <w:lang w:val="pt-BR"/>
+        </w:rPr>
+      </w:pPr>
+      <w:r>
+        <w:rPr>
+          <w:lang w:val="pt-BR"/>
+        </w:rPr>
+        <w:t>DIA 2 | Buscas e filtros</w:t>
       </w:r>
     </w:p>
     <w:p>
@@ -1010,22 +1671,65 @@
         <w:rPr>
           <w:lang w:val="pt-BR"/>
         </w:rPr>
-        <w:br w:type="page"/>
+        <w:t xml:space="preserve">Referência: Manual do Aluno — Dia 2 | Conteúdos: </w:t>
+      </w:r>
+      <w:proofErr w:type="spellStart"/>
+      <w:proofErr w:type="gramStart"/>
+      <w:r>
+        <w:rPr>
+          <w:lang w:val="pt-BR"/>
+        </w:rPr>
+        <w:t>find</w:t>
+      </w:r>
+      <w:proofErr w:type="spellEnd"/>
+      <w:r>
+        <w:rPr>
+          <w:lang w:val="pt-BR"/>
+        </w:rPr>
+        <w:t>(</w:t>
+      </w:r>
+      <w:proofErr w:type="gramEnd"/>
+      <w:r>
+        <w:rPr>
+          <w:lang w:val="pt-BR"/>
+        </w:rPr>
+        <w:t xml:space="preserve">), </w:t>
+      </w:r>
+      <w:proofErr w:type="spellStart"/>
+      <w:proofErr w:type="gramStart"/>
+      <w:r>
+        <w:rPr>
+          <w:lang w:val="pt-BR"/>
+        </w:rPr>
+        <w:t>filter</w:t>
+      </w:r>
+      <w:proofErr w:type="spellEnd"/>
+      <w:r>
+        <w:rPr>
+          <w:lang w:val="pt-BR"/>
+        </w:rPr>
+        <w:t>(</w:t>
+      </w:r>
+      <w:proofErr w:type="gramEnd"/>
+      <w:r>
+        <w:rPr>
+          <w:lang w:val="pt-BR"/>
+        </w:rPr>
+        <w:t>), consultas sem resultado e testes.</w:t>
       </w:r>
     </w:p>
     <w:p>
       <w:pPr>
-        <w:pStyle w:val="Ttulo1"/>
-        <w:rPr>
-          <w:lang w:val="pt-BR"/>
-        </w:rPr>
-      </w:pPr>
-      <w:r>
-        <w:rPr>
-          <w:lang w:val="pt-BR"/>
-        </w:rPr>
-        <w:lastRenderedPageBreak/>
-        <w:t>DIA 2 | Buscas e filtros</w:t>
+        <w:pStyle w:val="Ttulo2"/>
+        <w:rPr>
+          <w:lang w:val="pt-BR"/>
+        </w:rPr>
+      </w:pPr>
+      <w:r>
+        <w:rPr>
+          <w:lang w:val="pt-BR"/>
+        </w:rPr>
+        <w:t>A. Compreensão dos métodos</w:t>
       </w:r>
     </w:p>
     <w:p>
@@ -1036,23 +1740,74 @@
       </w:pPr>
       <w:r>
         <w:rPr>
-          <w:lang w:val="pt-BR"/>
-        </w:rPr>
-        <w:t>Referência: Manual do Aluno — Dia 2 | Conteúdos: find(), filter(), consultas sem resultado e testes.</w:t>
+          <w:b/>
+          <w:lang w:val="pt-BR"/>
+        </w:rPr>
+        <w:t xml:space="preserve">12. Qual é a diferença entre </w:t>
+      </w:r>
+      <w:proofErr w:type="spellStart"/>
+      <w:proofErr w:type="gramStart"/>
+      <w:r>
+        <w:rPr>
+          <w:b/>
+          <w:lang w:val="pt-BR"/>
+        </w:rPr>
+        <w:t>find</w:t>
+      </w:r>
+      <w:proofErr w:type="spellEnd"/>
+      <w:r>
+        <w:rPr>
+          <w:b/>
+          <w:lang w:val="pt-BR"/>
+        </w:rPr>
+        <w:t>(</w:t>
+      </w:r>
+      <w:proofErr w:type="gramEnd"/>
+      <w:r>
+        <w:rPr>
+          <w:b/>
+          <w:lang w:val="pt-BR"/>
+        </w:rPr>
+        <w:t xml:space="preserve">) e </w:t>
+      </w:r>
+      <w:proofErr w:type="spellStart"/>
+      <w:proofErr w:type="gramStart"/>
+      <w:r>
+        <w:rPr>
+          <w:b/>
+          <w:lang w:val="pt-BR"/>
+        </w:rPr>
+        <w:t>filter</w:t>
+      </w:r>
+      <w:proofErr w:type="spellEnd"/>
+      <w:r>
+        <w:rPr>
+          <w:b/>
+          <w:lang w:val="pt-BR"/>
+        </w:rPr>
+        <w:t>(</w:t>
+      </w:r>
+      <w:proofErr w:type="gramEnd"/>
+      <w:r>
+        <w:rPr>
+          <w:b/>
+          <w:lang w:val="pt-BR"/>
+        </w:rPr>
+        <w:t>) quanto ao resultado retornado?</w:t>
       </w:r>
     </w:p>
     <w:p>
       <w:pPr>
-        <w:pStyle w:val="Ttulo2"/>
-        <w:rPr>
-          <w:lang w:val="pt-BR"/>
-        </w:rPr>
-      </w:pPr>
-      <w:r>
-        <w:rPr>
-          <w:lang w:val="pt-BR"/>
-        </w:rPr>
-        <w:t>A. Compreensão dos métodos</w:t>
+        <w:rPr>
+          <w:lang w:val="pt-BR"/>
+        </w:rPr>
+      </w:pPr>
+      <w:r>
+        <w:rPr>
+          <w:color w:val="AAB1B7"/>
+          <w:lang w:val="pt-BR"/>
+        </w:rPr>
+        <w:t>__________________________________________________________________________________</w:t>
       </w:r>
     </w:p>
     <w:p>
@@ -1063,10 +1818,10 @@
       </w:pPr>
       <w:r>
         <w:rPr>
-          <w:b/>
-          <w:lang w:val="pt-BR"/>
-        </w:rPr>
-        <w:t>12. Qual é a diferença entre find() e filter() quanto ao resultado retornado?</w:t>
+          <w:color w:val="AAB1B7"/>
+          <w:lang w:val="pt-BR"/>
+        </w:rPr>
+        <w:t>__________________________________________________________________________________</w:t>
       </w:r>
     </w:p>
     <w:p>
@@ -1077,10 +1832,60 @@
       </w:pPr>
       <w:r>
         <w:rPr>
-          <w:color w:val="AAB1B7"/>
-          <w:lang w:val="pt-BR"/>
-        </w:rPr>
-        <w:t>__________________________________________________________________________________</w:t>
+          <w:b/>
+          <w:lang w:val="pt-BR"/>
+        </w:rPr>
+        <w:t xml:space="preserve">13. O que </w:t>
+      </w:r>
+      <w:proofErr w:type="spellStart"/>
+      <w:proofErr w:type="gramStart"/>
+      <w:r>
+        <w:rPr>
+          <w:b/>
+          <w:lang w:val="pt-BR"/>
+        </w:rPr>
+        <w:t>find</w:t>
+      </w:r>
+      <w:proofErr w:type="spellEnd"/>
+      <w:r>
+        <w:rPr>
+          <w:b/>
+          <w:lang w:val="pt-BR"/>
+        </w:rPr>
+        <w:t>(</w:t>
+      </w:r>
+      <w:proofErr w:type="gramEnd"/>
+      <w:r>
+        <w:rPr>
+          <w:b/>
+          <w:lang w:val="pt-BR"/>
+        </w:rPr>
+        <w:t xml:space="preserve">) retorna quando o ID procurado não existe? E </w:t>
+      </w:r>
+      <w:proofErr w:type="spellStart"/>
+      <w:proofErr w:type="gramStart"/>
+      <w:r>
+        <w:rPr>
+          <w:b/>
+          <w:lang w:val="pt-BR"/>
+        </w:rPr>
+        <w:t>filter</w:t>
+      </w:r>
+      <w:proofErr w:type="spellEnd"/>
+      <w:r>
+        <w:rPr>
+          <w:b/>
+          <w:lang w:val="pt-BR"/>
+        </w:rPr>
+        <w:t>(</w:t>
+      </w:r>
+      <w:proofErr w:type="gramEnd"/>
+      <w:r>
+        <w:rPr>
+          <w:b/>
+          <w:lang w:val="pt-BR"/>
+        </w:rPr>
+        <w:t>) quando nenhum elemento atende à condição?</w:t>
       </w:r>
     </w:p>
     <w:p>
@@ -1105,10 +1910,10 @@
       </w:pPr>
       <w:r>
         <w:rPr>
-          <w:b/>
-          <w:lang w:val="pt-BR"/>
-        </w:rPr>
-        <w:t>13. O que find() retorna quando o ID procurado não existe? E filter() quando nenhum elemento atende à condição?</w:t>
+          <w:color w:val="AAB1B7"/>
+          <w:lang w:val="pt-BR"/>
+        </w:rPr>
+        <w:t>__________________________________________________________________________________</w:t>
       </w:r>
     </w:p>
     <w:p>
@@ -1119,10 +1924,10 @@
       </w:pPr>
       <w:r>
         <w:rPr>
-          <w:color w:val="AAB1B7"/>
-          <w:lang w:val="pt-BR"/>
-        </w:rPr>
-        <w:t>__________________________________________________________________________________</w:t>
+          <w:b/>
+          <w:lang w:val="pt-BR"/>
+        </w:rPr>
+        <w:t>14. Por que a comparação 3 === "3" resulta em false?</w:t>
       </w:r>
     </w:p>
     <w:p>
@@ -1147,10 +1952,10 @@
       </w:pPr>
       <w:r>
         <w:rPr>
-          <w:b/>
-          <w:lang w:val="pt-BR"/>
-        </w:rPr>
-        <w:t>14. Por que a comparação 3 === "3" resulta em false?</w:t>
+          <w:color w:val="AAB1B7"/>
+          <w:lang w:val="pt-BR"/>
+        </w:rPr>
+        <w:t>__________________________________________________________________________________</w:t>
       </w:r>
     </w:p>
     <w:p>
@@ -1161,10 +1966,10 @@
       </w:pPr>
       <w:r>
         <w:rPr>
-          <w:color w:val="AAB1B7"/>
-          <w:lang w:val="pt-BR"/>
-        </w:rPr>
-        <w:t>__________________________________________________________________________________</w:t>
+          <w:b/>
+          <w:lang w:val="pt-BR"/>
+        </w:rPr>
+        <w:t>15. Explique o que o programa deve fazer quando a consulta não encontra uma máquina.</w:t>
       </w:r>
     </w:p>
     <w:p>
@@ -1189,24 +1994,24 @@
       </w:pPr>
       <w:r>
         <w:rPr>
-          <w:b/>
-          <w:lang w:val="pt-BR"/>
-        </w:rPr>
-        <w:t>15. Explique o que o programa deve fazer quando a consulta não encontra uma máquina.</w:t>
+          <w:color w:val="AAB1B7"/>
+          <w:lang w:val="pt-BR"/>
+        </w:rPr>
+        <w:t>__________________________________________________________________________________</w:t>
       </w:r>
     </w:p>
     <w:p>
       <w:pPr>
-        <w:rPr>
-          <w:lang w:val="pt-BR"/>
-        </w:rPr>
-      </w:pPr>
-      <w:r>
-        <w:rPr>
-          <w:color w:val="AAB1B7"/>
-          <w:lang w:val="pt-BR"/>
-        </w:rPr>
-        <w:t>__________________________________________________________________________________</w:t>
+        <w:pStyle w:val="Ttulo2"/>
+        <w:rPr>
+          <w:lang w:val="pt-BR"/>
+        </w:rPr>
+      </w:pPr>
+      <w:r>
+        <w:rPr>
+          <w:lang w:val="pt-BR"/>
+        </w:rPr>
+        <w:t>B. Testes obrigatórios</w:t>
       </w:r>
     </w:p>
     <w:p>
@@ -1217,37 +2022,25 @@
       </w:pPr>
       <w:r>
         <w:rPr>
-          <w:color w:val="AAB1B7"/>
-          <w:lang w:val="pt-BR"/>
-        </w:rPr>
-        <w:t>__________________________________________________________________________________</w:t>
-      </w:r>
-    </w:p>
-    <w:p>
-      <w:pPr>
-        <w:pStyle w:val="Ttulo2"/>
-        <w:rPr>
-          <w:lang w:val="pt-BR"/>
-        </w:rPr>
-      </w:pPr>
-      <w:r>
-        <w:rPr>
-          <w:lang w:val="pt-BR"/>
-        </w:rPr>
-        <w:t>B. Testes obrigatórios</w:t>
-      </w:r>
-    </w:p>
-    <w:p>
-      <w:pPr>
-        <w:rPr>
-          <w:lang w:val="pt-BR"/>
-        </w:rPr>
-      </w:pPr>
-      <w:r>
-        <w:rPr>
-          <w:lang w:val="pt-BR"/>
-        </w:rPr>
-        <w:t>Execute cada caso e registre a saída obtida. Quando possível, use os nomes e valores exatos de maquinas.json.</w:t>
+          <w:lang w:val="pt-BR"/>
+        </w:rPr>
+        <w:t xml:space="preserve">Execute cada caso e registre a saída obtida. Quando possível, use os nomes e valores exatos de </w:t>
+      </w:r>
+      <w:proofErr w:type="spellStart"/>
+      <w:proofErr w:type="gramStart"/>
+      <w:r>
+        <w:rPr>
+          <w:lang w:val="pt-BR"/>
+        </w:rPr>
+        <w:t>maquinas.json</w:t>
+      </w:r>
+      <w:proofErr w:type="spellEnd"/>
+      <w:proofErr w:type="gramEnd"/>
+      <w:r>
+        <w:rPr>
+          <w:lang w:val="pt-BR"/>
+        </w:rPr>
+        <w:t>.</w:t>
       </w:r>
     </w:p>
     <w:tbl>
@@ -1315,6 +2108,7 @@
           </w:tcPr>
           <w:p>
             <w:r>
+              <w:lastRenderedPageBreak/>
               <w:t>carregarMaquinas()</w:t>
             </w:r>
           </w:p>
@@ -1833,7 +2627,23 @@
           <w:b/>
           <w:lang w:val="pt-BR"/>
         </w:rPr>
-        <w:t>17. Explique por que a operação READ é importante em sistemas Back-End reais.</w:t>
+        <w:t>17. Explique por que a operação READ é importante em sistemas Back-</w:t>
+      </w:r>
+      <w:proofErr w:type="spellStart"/>
+      <w:r>
+        <w:rPr>
+          <w:b/>
+          <w:lang w:val="pt-BR"/>
+        </w:rPr>
+        <w:t>End</w:t>
+      </w:r>
+      <w:proofErr w:type="spellEnd"/>
+      <w:r>
+        <w:rPr>
+          <w:b/>
+          <w:lang w:val="pt-BR"/>
+        </w:rPr>
+        <w:t xml:space="preserve"> reais.</w:t>
       </w:r>
     </w:p>
     <w:p>
@@ -1897,11 +2707,35 @@
           <w:lang w:val="pt-BR"/>
         </w:rPr>
       </w:pPr>
-      <w:r>
-        <w:rPr>
-          <w:lang w:val="pt-BR"/>
-        </w:rPr>
-        <w:t>[  ] Li e converti maquinas.json sem alterar os dados originais.</w:t>
+      <w:proofErr w:type="gramStart"/>
+      <w:r>
+        <w:rPr>
+          <w:lang w:val="pt-BR"/>
+        </w:rPr>
+        <w:t>[  ]</w:t>
+      </w:r>
+      <w:proofErr w:type="gramEnd"/>
+      <w:r>
+        <w:rPr>
+          <w:lang w:val="pt-BR"/>
+        </w:rPr>
+        <w:t xml:space="preserve"> Li e converti </w:t>
+      </w:r>
+      <w:proofErr w:type="spellStart"/>
+      <w:proofErr w:type="gramStart"/>
+      <w:r>
+        <w:rPr>
+          <w:lang w:val="pt-BR"/>
+        </w:rPr>
+        <w:t>maquinas.json</w:t>
+      </w:r>
+      <w:proofErr w:type="spellEnd"/>
+      <w:proofErr w:type="gramEnd"/>
+      <w:r>
+        <w:rPr>
+          <w:lang w:val="pt-BR"/>
+        </w:rPr>
+        <w:t xml:space="preserve"> sem alterar os dados originais.</w:t>
       </w:r>
     </w:p>
     <w:p>
@@ -1910,11 +2744,19 @@
           <w:lang w:val="pt-BR"/>
         </w:rPr>
       </w:pPr>
-      <w:r>
-        <w:rPr>
-          <w:lang w:val="pt-BR"/>
-        </w:rPr>
-        <w:t>[  ] Listei as 8 máquinas.</w:t>
+      <w:proofErr w:type="gramStart"/>
+      <w:r>
+        <w:rPr>
+          <w:lang w:val="pt-BR"/>
+        </w:rPr>
+        <w:t>[  ]</w:t>
+      </w:r>
+      <w:proofErr w:type="gramEnd"/>
+      <w:r>
+        <w:rPr>
+          <w:lang w:val="pt-BR"/>
+        </w:rPr>
+        <w:t xml:space="preserve"> Listei as 8 máquinas.</w:t>
       </w:r>
     </w:p>
     <w:p>
@@ -1923,11 +2765,19 @@
           <w:lang w:val="pt-BR"/>
         </w:rPr>
       </w:pPr>
-      <w:r>
-        <w:rPr>
-          <w:lang w:val="pt-BR"/>
-        </w:rPr>
-        <w:t>[  ] Testei uma busca existente e outra inexistente.</w:t>
+      <w:proofErr w:type="gramStart"/>
+      <w:r>
+        <w:rPr>
+          <w:lang w:val="pt-BR"/>
+        </w:rPr>
+        <w:t>[  ]</w:t>
+      </w:r>
+      <w:proofErr w:type="gramEnd"/>
+      <w:r>
+        <w:rPr>
+          <w:lang w:val="pt-BR"/>
+        </w:rPr>
+        <w:t xml:space="preserve"> Testei uma busca existente e outra inexistente.</w:t>
       </w:r>
     </w:p>
     <w:p>
@@ -1936,11 +2786,19 @@
           <w:lang w:val="pt-BR"/>
         </w:rPr>
       </w:pPr>
-      <w:r>
-        <w:rPr>
-          <w:lang w:val="pt-BR"/>
-        </w:rPr>
-        <w:t>[  ] Testei filtros com resultados e sem resultados.</w:t>
+      <w:proofErr w:type="gramStart"/>
+      <w:r>
+        <w:rPr>
+          <w:lang w:val="pt-BR"/>
+        </w:rPr>
+        <w:t>[  ]</w:t>
+      </w:r>
+      <w:proofErr w:type="gramEnd"/>
+      <w:r>
+        <w:rPr>
+          <w:lang w:val="pt-BR"/>
+        </w:rPr>
+        <w:t xml:space="preserve"> Testei filtros com resultados e sem resultados.</w:t>
       </w:r>
     </w:p>
     <w:p>
@@ -1949,11 +2807,47 @@
           <w:lang w:val="pt-BR"/>
         </w:rPr>
       </w:pPr>
-      <w:r>
-        <w:rPr>
-          <w:lang w:val="pt-BR"/>
-        </w:rPr>
-        <w:t>[  ] Executei os testes disponíveis no projeto (npm test).</w:t>
+      <w:proofErr w:type="gramStart"/>
+      <w:r>
+        <w:rPr>
+          <w:lang w:val="pt-BR"/>
+        </w:rPr>
+        <w:t>[  ]</w:t>
+      </w:r>
+      <w:proofErr w:type="gramEnd"/>
+      <w:r>
+        <w:rPr>
+          <w:lang w:val="pt-BR"/>
+        </w:rPr>
+        <w:t xml:space="preserve"> Executei os testes disponíveis no projeto (</w:t>
+      </w:r>
+      <w:proofErr w:type="spellStart"/>
+      <w:r>
+        <w:rPr>
+          <w:lang w:val="pt-BR"/>
+        </w:rPr>
+        <w:t>npm</w:t>
+      </w:r>
+      <w:proofErr w:type="spellEnd"/>
+      <w:r>
+        <w:rPr>
+          <w:lang w:val="pt-BR"/>
+        </w:rPr>
+        <w:t xml:space="preserve"> </w:t>
+      </w:r>
+      <w:proofErr w:type="spellStart"/>
+      <w:r>
+        <w:rPr>
+          <w:lang w:val="pt-BR"/>
+        </w:rPr>
+        <w:t>test</w:t>
+      </w:r>
+      <w:proofErr w:type="spellEnd"/>
+      <w:r>
+        <w:rPr>
+          <w:lang w:val="pt-BR"/>
+        </w:rPr>
+        <w:t>).</w:t>
       </w:r>
     </w:p>
     <w:p>
@@ -1962,11 +2856,19 @@
           <w:lang w:val="pt-BR"/>
         </w:rPr>
       </w:pPr>
-      <w:r>
-        <w:rPr>
-          <w:lang w:val="pt-BR"/>
-        </w:rPr>
-        <w:t>[  ] Revisei os erros e documentei as evidências.</w:t>
+      <w:proofErr w:type="gramStart"/>
+      <w:r>
+        <w:rPr>
+          <w:lang w:val="pt-BR"/>
+        </w:rPr>
+        <w:t>[  ]</w:t>
+      </w:r>
+      <w:proofErr w:type="gramEnd"/>
+      <w:r>
+        <w:rPr>
+          <w:lang w:val="pt-BR"/>
+        </w:rPr>
+        <w:t xml:space="preserve"> Revisei os erros e documentei as evidências.</w:t>
       </w:r>
     </w:p>
     <w:p>
@@ -1975,11 +2877,19 @@
           <w:lang w:val="pt-BR"/>
         </w:rPr>
       </w:pPr>
-      <w:r>
-        <w:rPr>
-          <w:lang w:val="pt-BR"/>
-        </w:rPr>
-        <w:t>[  ] Preparei o relatório PDF e os arquivos de entrega.</w:t>
+      <w:proofErr w:type="gramStart"/>
+      <w:r>
+        <w:rPr>
+          <w:lang w:val="pt-BR"/>
+        </w:rPr>
+        <w:t>[  ]</w:t>
+      </w:r>
+      <w:proofErr w:type="gramEnd"/>
+      <w:r>
+        <w:rPr>
+          <w:lang w:val="pt-BR"/>
+        </w:rPr>
+        <w:t xml:space="preserve"> Preparei o relatório PDF e os arquivos de entrega.</w:t>
       </w:r>
     </w:p>
     <w:p>
@@ -1997,12 +2907,28 @@
     </w:p>
     <w:p>
       <w:r>
-        <w:t>Data: ____/____/2026      Aluno(a): __________________________________________</w:t>
+        <w:t>Data: __</w:t>
+      </w:r>
+      <w:proofErr w:type="gramStart"/>
+      <w:r>
+        <w:t>__/</w:t>
+      </w:r>
+      <w:proofErr w:type="gramEnd"/>
+      <w:r>
+        <w:t xml:space="preserve">____/2026      </w:t>
+      </w:r>
+      <w:proofErr w:type="spellStart"/>
+      <w:r>
+        <w:t>Aluno</w:t>
+      </w:r>
+      <w:proofErr w:type="spellEnd"/>
+      <w:r>
+        <w:t>(a): __________________________________________</w:t>
       </w:r>
     </w:p>
     <w:sectPr>
-      <w:headerReference w:type="default" r:id="rId8"/>
-      <w:footerReference w:type="default" r:id="rId9"/>
+      <w:headerReference w:type="default" r:id="rId9"/>
+      <w:footerReference w:type="default" r:id="rId10"/>
       <w:pgSz w:w="12240" w:h="15840"/>
       <w:pgMar w:top="1020" w:right="1191" w:bottom="964" w:left="1276" w:header="720" w:footer="720" w:gutter="0"/>
       <w:cols w:space="720"/>
@@ -2914,7 +3840,6 @@
   <w:style w:type="character" w:default="1" w:styleId="Fontepargpadro">
     <w:name w:val="Default Paragraph Font"/>
     <w:uiPriority w:val="1"/>
-    <w:semiHidden/>
     <w:unhideWhenUsed/>
   </w:style>
   <w:style w:type="table" w:default="1" w:styleId="Tabelanormal">

</xml_diff>

<commit_message>
att e add de atividade
</commit_message>
<xml_diff>
--- a/2_termo/BACKEND/Aulas/Aula_14/GABRIEL LÚCIO DE ARAUJO - Modelo_Relatorio_CRUD_READ_Aluno.docx
+++ b/2_termo/BACKEND/Aulas/Aula_14/GABRIEL LÚCIO DE ARAUJO - Modelo_Relatorio_CRUD_READ_Aluno.docx
@@ -26,35 +26,7 @@
         <w:rPr>
           <w:lang w:val="pt-BR"/>
         </w:rPr>
-        <w:t xml:space="preserve">CRUD — </w:t>
-      </w:r>
-      <w:proofErr w:type="gramStart"/>
-      <w:r>
-        <w:rPr>
-          <w:lang w:val="pt-BR"/>
-        </w:rPr>
-        <w:t>READ  |</w:t>
-      </w:r>
-      <w:proofErr w:type="gramEnd"/>
-      <w:r>
-        <w:rPr>
-          <w:lang w:val="pt-BR"/>
-        </w:rPr>
-        <w:t xml:space="preserve">  Node.js, </w:t>
-      </w:r>
-      <w:proofErr w:type="spellStart"/>
-      <w:r>
-        <w:rPr>
-          <w:lang w:val="pt-BR"/>
-        </w:rPr>
-        <w:t>fs</w:t>
-      </w:r>
-      <w:proofErr w:type="spellEnd"/>
-      <w:r>
-        <w:rPr>
-          <w:lang w:val="pt-BR"/>
-        </w:rPr>
-        <w:t xml:space="preserve"> e arquivos JSON</w:t>
+        <w:t>CRUD — READ  |  Node.js, fs e arquivos JSON</w:t>
       </w:r>
     </w:p>
     <w:p>
@@ -74,11 +46,9 @@
       <w:pPr>
         <w:pStyle w:val="Ttulo2"/>
       </w:pPr>
-      <w:proofErr w:type="spellStart"/>
       <w:r>
         <w:t>Identificação</w:t>
       </w:r>
-      <w:proofErr w:type="spellEnd"/>
     </w:p>
     <w:tbl>
       <w:tblPr>
@@ -225,16 +195,11 @@
               <w:cnfStyle w:val="000000000000" w:firstRow="0" w:lastRow="0" w:firstColumn="0" w:lastColumn="0" w:oddVBand="0" w:evenVBand="0" w:oddHBand="0" w:evenHBand="0" w:firstRowFirstColumn="0" w:firstRowLastColumn="0" w:lastRowFirstColumn="0" w:lastRowLastColumn="0"/>
             </w:pPr>
             <w:r>
-              <w:t>Dia 1</w:t>
-            </w:r>
-            <w:proofErr w:type="gramStart"/>
-            <w:r>
-              <w:t xml:space="preserve">: </w:t>
+              <w:t xml:space="preserve">Dia 1: </w:t>
             </w:r>
             <w:r>
               <w:t xml:space="preserve"> 20</w:t>
             </w:r>
-            <w:proofErr w:type="gramEnd"/>
             <w:r>
               <w:t>/</w:t>
             </w:r>
@@ -242,15 +207,7 @@
               <w:t>10</w:t>
             </w:r>
             <w:r>
-              <w:t>/2026   |   Dia 2: __</w:t>
-            </w:r>
-            <w:proofErr w:type="gramStart"/>
-            <w:r>
-              <w:t>_/_</w:t>
-            </w:r>
-            <w:proofErr w:type="gramEnd"/>
-            <w:r>
-              <w:t>__/2026</w:t>
+              <w:t>/2026   |   Dia 2: ___/___/2026</w:t>
             </w:r>
           </w:p>
         </w:tc>
@@ -316,21 +273,7 @@
         <w:rPr>
           <w:lang w:val="pt-BR"/>
         </w:rPr>
-        <w:t xml:space="preserve">• Desenvolva e teste o código no VS </w:t>
-      </w:r>
-      <w:proofErr w:type="spellStart"/>
-      <w:r>
-        <w:rPr>
-          <w:lang w:val="pt-BR"/>
-        </w:rPr>
-        <w:t>Code</w:t>
-      </w:r>
-      <w:proofErr w:type="spellEnd"/>
-      <w:r>
-        <w:rPr>
-          <w:lang w:val="pt-BR"/>
-        </w:rPr>
-        <w:t xml:space="preserve"> com Node.js; registre saídas reais do terminal.</w:t>
+        <w:t>• Desenvolva e teste o código no VS Code com Node.js; registre saídas reais do terminal.</w:t>
       </w:r>
     </w:p>
     <w:p>
@@ -343,21 +286,7 @@
         <w:rPr>
           <w:lang w:val="pt-BR"/>
         </w:rPr>
-        <w:t xml:space="preserve">• Use o </w:t>
-      </w:r>
-      <w:proofErr w:type="spellStart"/>
-      <w:r>
-        <w:rPr>
-          <w:lang w:val="pt-BR"/>
-        </w:rPr>
-        <w:t>NotebookLM</w:t>
-      </w:r>
-      <w:proofErr w:type="spellEnd"/>
-      <w:r>
-        <w:rPr>
-          <w:lang w:val="pt-BR"/>
-        </w:rPr>
-        <w:t xml:space="preserve"> e os manuais para estudar, mas não copie explicações sem compreendê-las.</w:t>
+        <w:t>• Use o NotebookLM e os manuais para estudar, mas não copie explicações sem compreendê-las.</w:t>
       </w:r>
     </w:p>
     <w:p>
@@ -383,21 +312,7 @@
         <w:rPr>
           <w:lang w:val="pt-BR"/>
         </w:rPr>
-        <w:t xml:space="preserve">• Entregas: Dia 1 — app.js parcial + relatório PDF; Dia 2 — projeto final ZIP (sem </w:t>
-      </w:r>
-      <w:proofErr w:type="spellStart"/>
-      <w:r>
-        <w:rPr>
-          <w:lang w:val="pt-BR"/>
-        </w:rPr>
-        <w:t>node_modules</w:t>
-      </w:r>
-      <w:proofErr w:type="spellEnd"/>
-      <w:r>
-        <w:rPr>
-          <w:lang w:val="pt-BR"/>
-        </w:rPr>
-        <w:t>) + relatório PDF atualizado.</w:t>
+        <w:t>• Entregas: Dia 1 — app.js parcial + relatório PDF; Dia 2 — projeto final ZIP (sem node_modules) + relatório PDF atualizado.</w:t>
       </w:r>
     </w:p>
     <w:p>
@@ -494,59 +409,7 @@
         <w:rPr>
           <w:lang w:val="pt-BR"/>
         </w:rPr>
-        <w:t xml:space="preserve">Referência: Manual do Aluno — Dia 1 | Conteúdos: persistência, </w:t>
-      </w:r>
-      <w:proofErr w:type="spellStart"/>
-      <w:proofErr w:type="gramStart"/>
-      <w:r>
-        <w:rPr>
-          <w:lang w:val="pt-BR"/>
-        </w:rPr>
-        <w:t>fs.readFileSync</w:t>
-      </w:r>
-      <w:proofErr w:type="spellEnd"/>
-      <w:proofErr w:type="gramEnd"/>
-      <w:r>
-        <w:rPr>
-          <w:lang w:val="pt-BR"/>
-        </w:rPr>
-        <w:t xml:space="preserve">(), </w:t>
-      </w:r>
-      <w:proofErr w:type="spellStart"/>
-      <w:r>
-        <w:rPr>
-          <w:lang w:val="pt-BR"/>
-        </w:rPr>
-        <w:t>JSON.parse</w:t>
-      </w:r>
-      <w:proofErr w:type="spellEnd"/>
-      <w:r>
-        <w:rPr>
-          <w:lang w:val="pt-BR"/>
-        </w:rPr>
-        <w:t xml:space="preserve">() e </w:t>
-      </w:r>
-      <w:proofErr w:type="spellStart"/>
-      <w:proofErr w:type="gramStart"/>
-      <w:r>
-        <w:rPr>
-          <w:lang w:val="pt-BR"/>
-        </w:rPr>
-        <w:t>forEach</w:t>
-      </w:r>
-      <w:proofErr w:type="spellEnd"/>
-      <w:r>
-        <w:rPr>
-          <w:lang w:val="pt-BR"/>
-        </w:rPr>
-        <w:t>(</w:t>
-      </w:r>
-      <w:proofErr w:type="gramEnd"/>
-      <w:r>
-        <w:rPr>
-          <w:lang w:val="pt-BR"/>
-        </w:rPr>
-        <w:t>).</w:t>
+        <w:t>Referência: Manual do Aluno — Dia 1 | Conteúdos: persistência, fs.readFileSync(), JSON.parse() e forEach().</w:t>
       </w:r>
     </w:p>
     <w:p>
@@ -639,23 +502,7 @@
           <w:color w:val="1F497D" w:themeColor="text2"/>
           <w:lang w:val="pt-BR"/>
         </w:rPr>
-        <w:t xml:space="preserve">faz o arquivo o outro </w:t>
-      </w:r>
-      <w:proofErr w:type="spellStart"/>
-      <w:r>
-        <w:rPr>
-          <w:color w:val="1F497D" w:themeColor="text2"/>
-          <w:lang w:val="pt-BR"/>
-        </w:rPr>
-        <w:t>encherga</w:t>
-      </w:r>
-      <w:proofErr w:type="spellEnd"/>
-      <w:r>
-        <w:rPr>
-          <w:color w:val="1F497D" w:themeColor="text2"/>
-          <w:lang w:val="pt-BR"/>
-        </w:rPr>
-        <w:t xml:space="preserve"> o arquivo.</w:t>
+        <w:t>faz o arquivo o outro encherga o arquivo.</w:t>
       </w:r>
     </w:p>
     <w:p>
@@ -669,23 +516,7 @@
           <w:b/>
           <w:lang w:val="pt-BR"/>
         </w:rPr>
-        <w:t xml:space="preserve">3. O conteúdo de um arquivo JSON é um texto ou um objeto </w:t>
-      </w:r>
-      <w:proofErr w:type="spellStart"/>
-      <w:r>
-        <w:rPr>
-          <w:b/>
-          <w:lang w:val="pt-BR"/>
-        </w:rPr>
-        <w:t>JavaScript</w:t>
-      </w:r>
-      <w:proofErr w:type="spellEnd"/>
-      <w:r>
-        <w:rPr>
-          <w:b/>
-          <w:lang w:val="pt-BR"/>
-        </w:rPr>
-        <w:t>? Explique.</w:t>
+        <w:t>3. O conteúdo de um arquivo JSON é um texto ou um objeto JavaScript? Explique.</w:t>
       </w:r>
     </w:p>
     <w:p>
@@ -700,45 +531,7 @@
           <w:color w:val="1F497D" w:themeColor="text2"/>
           <w:lang w:val="pt-BR"/>
         </w:rPr>
-        <w:t xml:space="preserve">O conteúdo de um arquivo JSON é </w:t>
-      </w:r>
-      <w:r>
-        <w:rPr>
-          <w:color w:val="1F497D" w:themeColor="text2"/>
-          <w:lang w:val="pt-BR"/>
-        </w:rPr>
-        <w:t>texto sendo</w:t>
-      </w:r>
-      <w:r>
-        <w:rPr>
-          <w:color w:val="1F497D" w:themeColor="text2"/>
-          <w:lang w:val="pt-BR"/>
-        </w:rPr>
-        <w:t xml:space="preserve"> uma estrutura de objetos </w:t>
-      </w:r>
-      <w:proofErr w:type="spellStart"/>
-      <w:r>
-        <w:rPr>
-          <w:color w:val="1F497D" w:themeColor="text2"/>
-          <w:lang w:val="pt-BR"/>
-        </w:rPr>
-        <w:t>JavaScript</w:t>
-      </w:r>
-      <w:proofErr w:type="spellEnd"/>
-      <w:r>
-        <w:rPr>
-          <w:color w:val="1F497D" w:themeColor="text2"/>
-          <w:lang w:val="pt-BR"/>
-        </w:rPr>
-        <w:t xml:space="preserve"> somente em memória após ser lido e convertido pela </w:t>
-      </w:r>
-      <w:proofErr w:type="gramStart"/>
-      <w:r>
-        <w:rPr>
-          <w:color w:val="1F497D" w:themeColor="text2"/>
-          <w:lang w:val="pt-BR"/>
-        </w:rPr>
-        <w:t xml:space="preserve">função </w:t>
+        <w:t xml:space="preserve">O conteúdo de um arquivo JSON é texto sendo uma estrutura de objetos JavaScript somente em memória após ser lido e convertido pela função </w:t>
       </w:r>
       <w:r>
         <w:rPr>
@@ -754,7 +547,6 @@
         </w:rPr>
         <w:t>arse</w:t>
       </w:r>
-      <w:proofErr w:type="gramEnd"/>
     </w:p>
     <w:p>
       <w:pPr>
@@ -767,25 +559,7 @@
           <w:b/>
           <w:lang w:val="pt-BR"/>
         </w:rPr>
-        <w:t xml:space="preserve">4. Quantos registros existem em </w:t>
-      </w:r>
-      <w:proofErr w:type="spellStart"/>
-      <w:proofErr w:type="gramStart"/>
-      <w:r>
-        <w:rPr>
-          <w:b/>
-          <w:lang w:val="pt-BR"/>
-        </w:rPr>
-        <w:t>maquinas.json</w:t>
-      </w:r>
-      <w:proofErr w:type="spellEnd"/>
-      <w:proofErr w:type="gramEnd"/>
-      <w:r>
-        <w:rPr>
-          <w:b/>
-          <w:lang w:val="pt-BR"/>
-        </w:rPr>
-        <w:t>? Como você confirmou?</w:t>
+        <w:t>4. Quantos registros existem em maquinas.json? Como você confirmou?</w:t>
       </w:r>
     </w:p>
     <w:p>
@@ -800,57 +574,14 @@
           <w:color w:val="1F497D" w:themeColor="text2"/>
           <w:lang w:val="pt-BR"/>
         </w:rPr>
-        <w:t xml:space="preserve">8, de duas maneiras, abrindo o </w:t>
+        <w:t xml:space="preserve">8, de duas maneiras, abrindo o maquinas.json ou </w:t>
       </w:r>
-      <w:proofErr w:type="spellStart"/>
-      <w:proofErr w:type="gramStart"/>
       <w:r>
         <w:rPr>
           <w:color w:val="1F497D" w:themeColor="text2"/>
           <w:lang w:val="pt-BR"/>
         </w:rPr>
-        <w:t>maquinas.json</w:t>
-      </w:r>
-      <w:proofErr w:type="spellEnd"/>
-      <w:proofErr w:type="gramEnd"/>
-      <w:r>
-        <w:rPr>
-          <w:color w:val="1F497D" w:themeColor="text2"/>
-          <w:lang w:val="pt-BR"/>
-        </w:rPr>
-        <w:t xml:space="preserve"> ou </w:t>
-      </w:r>
-      <w:proofErr w:type="spellStart"/>
-      <w:r>
-        <w:rPr>
-          <w:color w:val="1F497D" w:themeColor="text2"/>
-          <w:lang w:val="pt-BR"/>
-        </w:rPr>
-        <w:t>executanto</w:t>
-      </w:r>
-      <w:proofErr w:type="spellEnd"/>
-      <w:r>
-        <w:rPr>
-          <w:color w:val="1F497D" w:themeColor="text2"/>
-          <w:lang w:val="pt-BR"/>
-        </w:rPr>
-        <w:t xml:space="preserve"> no app.js uma leitura de quantos elementos tem </w:t>
-      </w:r>
-      <w:proofErr w:type="spellStart"/>
-      <w:r>
-        <w:rPr>
-          <w:color w:val="1F497D" w:themeColor="text2"/>
-          <w:lang w:val="pt-BR"/>
-        </w:rPr>
-        <w:t>la</w:t>
-      </w:r>
-      <w:proofErr w:type="spellEnd"/>
-      <w:r>
-        <w:rPr>
-          <w:color w:val="1F497D" w:themeColor="text2"/>
-          <w:lang w:val="pt-BR"/>
-        </w:rPr>
-        <w:t xml:space="preserve"> (objetos)</w:t>
+        <w:t>executanto no app.js uma leitura de quantos elementos tem la (objetos)</w:t>
       </w:r>
     </w:p>
     <w:p>
@@ -923,44 +654,7 @@
           <w:color w:val="1F497D" w:themeColor="text2"/>
           <w:lang w:val="pt-BR"/>
         </w:rPr>
-        <w:t>    "id</w:t>
-      </w:r>
-      <w:proofErr w:type="gramStart"/>
-      <w:r>
-        <w:rPr>
-          <w:color w:val="1F497D" w:themeColor="text2"/>
-          <w:lang w:val="pt-BR"/>
-        </w:rPr>
-        <w:t>"</w:t>
-      </w:r>
-      <w:r>
-        <w:rPr>
-          <w:color w:val="1F497D" w:themeColor="text2"/>
-          <w:lang w:val="pt-BR"/>
-        </w:rPr>
-        <w:t xml:space="preserve">, </w:t>
-      </w:r>
-      <w:r>
-        <w:rPr>
-          <w:color w:val="1F497D" w:themeColor="text2"/>
-          <w:lang w:val="pt-BR"/>
-        </w:rPr>
-        <w:t xml:space="preserve"> "</w:t>
-      </w:r>
-      <w:proofErr w:type="gramEnd"/>
-      <w:r>
-        <w:rPr>
-          <w:color w:val="1F497D" w:themeColor="text2"/>
-          <w:lang w:val="pt-BR"/>
-        </w:rPr>
-        <w:t>nome"</w:t>
-      </w:r>
-      <w:r>
-        <w:rPr>
-          <w:color w:val="1F497D" w:themeColor="text2"/>
-          <w:lang w:val="pt-BR"/>
-        </w:rPr>
-        <w:t>,</w:t>
+        <w:t>    "id",  "nome",</w:t>
       </w:r>
       <w:r>
         <w:rPr>
@@ -974,15 +668,7 @@
           <w:color w:val="1F497D" w:themeColor="text2"/>
           <w:lang w:val="pt-BR"/>
         </w:rPr>
-        <w:t>"setor"</w:t>
-      </w:r>
-      <w:proofErr w:type="gramStart"/>
-      <w:r>
-        <w:rPr>
-          <w:color w:val="1F497D" w:themeColor="text2"/>
-          <w:lang w:val="pt-BR"/>
-        </w:rPr>
-        <w:t>,</w:t>
+        <w:t>"setor",</w:t>
       </w:r>
       <w:r>
         <w:rPr>
@@ -996,15 +682,7 @@
           <w:color w:val="1F497D" w:themeColor="text2"/>
           <w:lang w:val="pt-BR"/>
         </w:rPr>
-        <w:t>”status</w:t>
-      </w:r>
-      <w:proofErr w:type="gramEnd"/>
-      <w:r>
-        <w:rPr>
-          <w:color w:val="1F497D" w:themeColor="text2"/>
-          <w:lang w:val="pt-BR"/>
-        </w:rPr>
-        <w:t xml:space="preserve">”, </w:t>
+        <w:t xml:space="preserve">”status”, </w:t>
       </w:r>
       <w:r>
         <w:rPr>
@@ -1055,23 +733,7 @@
           <w:b/>
           <w:lang w:val="pt-BR"/>
         </w:rPr>
-        <w:t xml:space="preserve">7. Por que utilizamos </w:t>
-      </w:r>
-      <w:proofErr w:type="spellStart"/>
-      <w:r>
-        <w:rPr>
-          <w:b/>
-          <w:lang w:val="pt-BR"/>
-        </w:rPr>
-        <w:t>JSON.parse</w:t>
-      </w:r>
-      <w:proofErr w:type="spellEnd"/>
-      <w:r>
-        <w:rPr>
-          <w:b/>
-          <w:lang w:val="pt-BR"/>
-        </w:rPr>
-        <w:t>() depois de ler o arquivo com utf8?</w:t>
+        <w:t>7. Por que utilizamos JSON.parse() depois de ler o arquivo com utf8?</w:t>
       </w:r>
     </w:p>
     <w:p>
@@ -1081,41 +743,13 @@
           <w:lang w:val="pt-BR"/>
         </w:rPr>
       </w:pPr>
-      <w:proofErr w:type="gramStart"/>
       <w:r>
         <w:rPr>
           <w:b/>
           <w:color w:val="1F497D" w:themeColor="text2"/>
           <w:lang w:val="pt-BR"/>
         </w:rPr>
-        <w:t>.parse</w:t>
-      </w:r>
-      <w:proofErr w:type="gramEnd"/>
-      <w:r>
-        <w:rPr>
-          <w:b/>
-          <w:color w:val="1F497D" w:themeColor="text2"/>
-          <w:lang w:val="pt-BR"/>
-        </w:rPr>
-        <w:t xml:space="preserve"> transforma em objeto para </w:t>
-      </w:r>
-      <w:proofErr w:type="spellStart"/>
-      <w:r>
-        <w:rPr>
-          <w:b/>
-          <w:color w:val="1F497D" w:themeColor="text2"/>
-          <w:lang w:val="pt-BR"/>
-        </w:rPr>
-        <w:t>javaScript</w:t>
-      </w:r>
-      <w:proofErr w:type="spellEnd"/>
-      <w:r>
-        <w:rPr>
-          <w:b/>
-          <w:color w:val="1F497D" w:themeColor="text2"/>
-          <w:lang w:val="pt-BR"/>
-        </w:rPr>
-        <w:t xml:space="preserve">, utf8 transforma tudo em texto </w:t>
+        <w:t xml:space="preserve">.parse transforma em objeto para javaScript, utf8 transforma tudo em texto </w:t>
       </w:r>
       <w:r>
         <w:rPr>
@@ -1138,39 +772,7 @@
           <w:b/>
           <w:lang w:val="pt-BR"/>
         </w:rPr>
-        <w:t xml:space="preserve">8. Por que o valor lido como </w:t>
-      </w:r>
-      <w:proofErr w:type="spellStart"/>
-      <w:r>
-        <w:rPr>
-          <w:b/>
-          <w:lang w:val="pt-BR"/>
-        </w:rPr>
-        <w:t>string</w:t>
-      </w:r>
-      <w:proofErr w:type="spellEnd"/>
-      <w:r>
-        <w:rPr>
-          <w:b/>
-          <w:lang w:val="pt-BR"/>
-        </w:rPr>
-        <w:t xml:space="preserve"> não pode ser percorrido diretamente como um </w:t>
-      </w:r>
-      <w:proofErr w:type="spellStart"/>
-      <w:r>
-        <w:rPr>
-          <w:b/>
-          <w:lang w:val="pt-BR"/>
-        </w:rPr>
-        <w:t>array</w:t>
-      </w:r>
-      <w:proofErr w:type="spellEnd"/>
-      <w:r>
-        <w:rPr>
-          <w:b/>
-          <w:lang w:val="pt-BR"/>
-        </w:rPr>
-        <w:t xml:space="preserve"> de máquinas?</w:t>
+        <w:t>8. Por que o valor lido como string não pode ser percorrido diretamente como um array de máquinas?</w:t>
       </w:r>
     </w:p>
     <w:p>
@@ -1185,44 +787,7 @@
           <w:color w:val="1F497D" w:themeColor="text2"/>
           <w:lang w:val="pt-BR"/>
         </w:rPr>
-        <w:t xml:space="preserve">A </w:t>
-      </w:r>
-      <w:proofErr w:type="spellStart"/>
-      <w:r>
-        <w:rPr>
-          <w:color w:val="1F497D" w:themeColor="text2"/>
-          <w:lang w:val="pt-BR"/>
-        </w:rPr>
-        <w:t>string</w:t>
-      </w:r>
-      <w:proofErr w:type="spellEnd"/>
-      <w:r>
-        <w:rPr>
-          <w:color w:val="1F497D" w:themeColor="text2"/>
-          <w:lang w:val="pt-BR"/>
-        </w:rPr>
-        <w:t xml:space="preserve"> lida representa apenas texto puro</w:t>
-      </w:r>
-      <w:r>
-        <w:rPr>
-          <w:color w:val="1F497D" w:themeColor="text2"/>
-          <w:lang w:val="pt-BR"/>
-        </w:rPr>
-        <w:t xml:space="preserve">, </w:t>
-      </w:r>
-      <w:r>
-        <w:rPr>
-          <w:color w:val="1F497D" w:themeColor="text2"/>
-          <w:lang w:val="pt-BR"/>
-        </w:rPr>
-        <w:t>permitindo navegar somente por caracteres individuais</w:t>
-      </w:r>
-      <w:r>
-        <w:rPr>
-          <w:color w:val="1F497D" w:themeColor="text2"/>
-          <w:lang w:val="pt-BR"/>
-        </w:rPr>
-        <w:t>.</w:t>
+        <w:t>A string lida representa apenas texto puro, permitindo navegar somente por caracteres individuais.</w:t>
       </w:r>
     </w:p>
     <w:p>
@@ -1285,32 +850,7 @@
           <w:b/>
           <w:lang w:val="pt-BR"/>
         </w:rPr>
-        <w:t xml:space="preserve">9. Descreva o que faz </w:t>
-      </w:r>
-      <w:proofErr w:type="spellStart"/>
-      <w:proofErr w:type="gramStart"/>
-      <w:r>
-        <w:rPr>
-          <w:b/>
-          <w:lang w:val="pt-BR"/>
-        </w:rPr>
-        <w:t>carregarMaquinas</w:t>
-      </w:r>
-      <w:proofErr w:type="spellEnd"/>
-      <w:r>
-        <w:rPr>
-          <w:b/>
-          <w:lang w:val="pt-BR"/>
-        </w:rPr>
-        <w:t>(</w:t>
-      </w:r>
-      <w:proofErr w:type="gramEnd"/>
-      <w:r>
-        <w:rPr>
-          <w:b/>
-          <w:lang w:val="pt-BR"/>
-        </w:rPr>
-        <w:t>): leitura do arquivo, conversão e retorno.</w:t>
+        <w:t>9. Descreva o que faz carregarMaquinas(): leitura do arquivo, conversão e retorno.</w:t>
       </w:r>
     </w:p>
     <w:p>
@@ -1332,64 +872,14 @@
           <w:color w:val="1F497D" w:themeColor="text2"/>
           <w:lang w:val="pt-BR"/>
         </w:rPr>
-        <w:t xml:space="preserve"> a principal </w:t>
-      </w:r>
-      <w:proofErr w:type="spellStart"/>
-      <w:r>
-        <w:rPr>
-          <w:color w:val="1F497D" w:themeColor="text2"/>
-          <w:lang w:val="pt-BR"/>
-        </w:rPr>
-        <w:t>funtion</w:t>
-      </w:r>
-      <w:proofErr w:type="spellEnd"/>
-      <w:r>
-        <w:rPr>
-          <w:color w:val="1F497D" w:themeColor="text2"/>
-          <w:lang w:val="pt-BR"/>
-        </w:rPr>
-        <w:t xml:space="preserve"> para todos funcionar, ela que importa o </w:t>
-      </w:r>
-      <w:proofErr w:type="spellStart"/>
-      <w:r>
-        <w:rPr>
-          <w:color w:val="1F497D" w:themeColor="text2"/>
-          <w:lang w:val="pt-BR"/>
-        </w:rPr>
-        <w:t>json</w:t>
-      </w:r>
-      <w:proofErr w:type="spellEnd"/>
-      <w:r>
-        <w:rPr>
-          <w:color w:val="1F497D" w:themeColor="text2"/>
-          <w:lang w:val="pt-BR"/>
-        </w:rPr>
-        <w:t xml:space="preserve"> e </w:t>
+        <w:t xml:space="preserve"> a principal funtion para todos funcionar, ela que importa o json e </w:t>
       </w:r>
       <w:r>
         <w:rPr>
           <w:color w:val="1F497D" w:themeColor="text2"/>
           <w:lang w:val="pt-BR"/>
         </w:rPr>
-        <w:t xml:space="preserve">converte em texto e em utf-8, e retorna tudo que </w:t>
-      </w:r>
-      <w:proofErr w:type="spellStart"/>
-      <w:proofErr w:type="gramStart"/>
-      <w:r>
-        <w:rPr>
-          <w:color w:val="1F497D" w:themeColor="text2"/>
-          <w:lang w:val="pt-BR"/>
-        </w:rPr>
-        <w:t>esta</w:t>
-      </w:r>
-      <w:proofErr w:type="spellEnd"/>
-      <w:proofErr w:type="gramEnd"/>
-      <w:r>
-        <w:rPr>
-          <w:color w:val="1F497D" w:themeColor="text2"/>
-          <w:lang w:val="pt-BR"/>
-        </w:rPr>
-        <w:t xml:space="preserve"> lá.</w:t>
+        <w:t>converte em texto e em utf-8, e retorna tudo que esta lá.</w:t>
       </w:r>
     </w:p>
     <w:p>
@@ -1403,57 +893,7 @@
           <w:b/>
           <w:lang w:val="pt-BR"/>
         </w:rPr>
-        <w:t xml:space="preserve">10. Explique como </w:t>
-      </w:r>
-      <w:proofErr w:type="spellStart"/>
-      <w:proofErr w:type="gramStart"/>
-      <w:r>
-        <w:rPr>
-          <w:b/>
-          <w:lang w:val="pt-BR"/>
-        </w:rPr>
-        <w:t>listarMaquinas</w:t>
-      </w:r>
-      <w:proofErr w:type="spellEnd"/>
-      <w:r>
-        <w:rPr>
-          <w:b/>
-          <w:lang w:val="pt-BR"/>
-        </w:rPr>
-        <w:t>(</w:t>
-      </w:r>
-      <w:proofErr w:type="gramEnd"/>
-      <w:r>
-        <w:rPr>
-          <w:b/>
-          <w:lang w:val="pt-BR"/>
-        </w:rPr>
-        <w:t xml:space="preserve">) utiliza </w:t>
-      </w:r>
-      <w:proofErr w:type="spellStart"/>
-      <w:proofErr w:type="gramStart"/>
-      <w:r>
-        <w:rPr>
-          <w:b/>
-          <w:lang w:val="pt-BR"/>
-        </w:rPr>
-        <w:t>forEach</w:t>
-      </w:r>
-      <w:proofErr w:type="spellEnd"/>
-      <w:r>
-        <w:rPr>
-          <w:b/>
-          <w:lang w:val="pt-BR"/>
-        </w:rPr>
-        <w:t>(</w:t>
-      </w:r>
-      <w:proofErr w:type="gramEnd"/>
-      <w:r>
-        <w:rPr>
-          <w:b/>
-          <w:lang w:val="pt-BR"/>
-        </w:rPr>
-        <w:t>) para exibir os registros.</w:t>
+        <w:t>10. Explique como listarMaquinas() utiliza forEach() para exibir os registros.</w:t>
       </w:r>
     </w:p>
     <w:p>
@@ -1468,39 +908,7 @@
           <w:color w:val="1F497D" w:themeColor="text2"/>
           <w:lang w:val="pt-BR"/>
         </w:rPr>
-        <w:t xml:space="preserve">Ele usa o </w:t>
-      </w:r>
-      <w:proofErr w:type="spellStart"/>
-      <w:r>
-        <w:rPr>
-          <w:color w:val="1F497D" w:themeColor="text2"/>
-          <w:lang w:val="pt-BR"/>
-        </w:rPr>
-        <w:t>forEach</w:t>
-      </w:r>
-      <w:proofErr w:type="spellEnd"/>
-      <w:r>
-        <w:rPr>
-          <w:color w:val="1F497D" w:themeColor="text2"/>
-          <w:lang w:val="pt-BR"/>
-        </w:rPr>
-        <w:t xml:space="preserve">, que é basicamente um for, uma repetição como no </w:t>
-      </w:r>
-      <w:proofErr w:type="spellStart"/>
-      <w:r>
-        <w:rPr>
-          <w:color w:val="1F497D" w:themeColor="text2"/>
-          <w:lang w:val="pt-BR"/>
-        </w:rPr>
-        <w:t>while</w:t>
-      </w:r>
-      <w:proofErr w:type="spellEnd"/>
-      <w:r>
-        <w:rPr>
-          <w:color w:val="1F497D" w:themeColor="text2"/>
-          <w:lang w:val="pt-BR"/>
-        </w:rPr>
-        <w:t xml:space="preserve">, </w:t>
+        <w:t xml:space="preserve">Ele usa o forEach, que é basicamente um for, uma repetição como no while, </w:t>
       </w:r>
       <w:r>
         <w:rPr>
@@ -1671,51 +1079,7 @@
         <w:rPr>
           <w:lang w:val="pt-BR"/>
         </w:rPr>
-        <w:t xml:space="preserve">Referência: Manual do Aluno — Dia 2 | Conteúdos: </w:t>
-      </w:r>
-      <w:proofErr w:type="spellStart"/>
-      <w:proofErr w:type="gramStart"/>
-      <w:r>
-        <w:rPr>
-          <w:lang w:val="pt-BR"/>
-        </w:rPr>
-        <w:t>find</w:t>
-      </w:r>
-      <w:proofErr w:type="spellEnd"/>
-      <w:r>
-        <w:rPr>
-          <w:lang w:val="pt-BR"/>
-        </w:rPr>
-        <w:t>(</w:t>
-      </w:r>
-      <w:proofErr w:type="gramEnd"/>
-      <w:r>
-        <w:rPr>
-          <w:lang w:val="pt-BR"/>
-        </w:rPr>
-        <w:t xml:space="preserve">), </w:t>
-      </w:r>
-      <w:proofErr w:type="spellStart"/>
-      <w:proofErr w:type="gramStart"/>
-      <w:r>
-        <w:rPr>
-          <w:lang w:val="pt-BR"/>
-        </w:rPr>
-        <w:t>filter</w:t>
-      </w:r>
-      <w:proofErr w:type="spellEnd"/>
-      <w:r>
-        <w:rPr>
-          <w:lang w:val="pt-BR"/>
-        </w:rPr>
-        <w:t>(</w:t>
-      </w:r>
-      <w:proofErr w:type="gramEnd"/>
-      <w:r>
-        <w:rPr>
-          <w:lang w:val="pt-BR"/>
-        </w:rPr>
-        <w:t>), consultas sem resultado e testes.</w:t>
+        <w:t>Referência: Manual do Aluno — Dia 2 | Conteúdos: find(), filter(), consultas sem resultado e testes.</w:t>
       </w:r>
     </w:p>
     <w:p>
@@ -1743,182 +1107,89 @@
           <w:b/>
           <w:lang w:val="pt-BR"/>
         </w:rPr>
-        <w:t xml:space="preserve">12. Qual é a diferença entre </w:t>
-      </w:r>
-      <w:proofErr w:type="spellStart"/>
-      <w:proofErr w:type="gramStart"/>
-      <w:r>
-        <w:rPr>
-          <w:b/>
-          <w:lang w:val="pt-BR"/>
-        </w:rPr>
-        <w:t>find</w:t>
-      </w:r>
-      <w:proofErr w:type="spellEnd"/>
-      <w:r>
-        <w:rPr>
-          <w:b/>
-          <w:lang w:val="pt-BR"/>
-        </w:rPr>
-        <w:t>(</w:t>
-      </w:r>
-      <w:proofErr w:type="gramEnd"/>
-      <w:r>
-        <w:rPr>
-          <w:b/>
-          <w:lang w:val="pt-BR"/>
-        </w:rPr>
-        <w:t xml:space="preserve">) e </w:t>
-      </w:r>
-      <w:proofErr w:type="spellStart"/>
-      <w:proofErr w:type="gramStart"/>
-      <w:r>
-        <w:rPr>
-          <w:b/>
-          <w:lang w:val="pt-BR"/>
-        </w:rPr>
-        <w:t>filter</w:t>
-      </w:r>
-      <w:proofErr w:type="spellEnd"/>
-      <w:r>
-        <w:rPr>
-          <w:b/>
-          <w:lang w:val="pt-BR"/>
-        </w:rPr>
-        <w:t>(</w:t>
-      </w:r>
-      <w:proofErr w:type="gramEnd"/>
-      <w:r>
-        <w:rPr>
-          <w:b/>
-          <w:lang w:val="pt-BR"/>
-        </w:rPr>
-        <w:t>) quanto ao resultado retornado?</w:t>
+        <w:t>12. Qual é a diferença entre find() e filter() quanto ao resultado retornado?</w:t>
       </w:r>
     </w:p>
     <w:p>
       <w:pPr>
         <w:rPr>
+          <w:color w:val="4F81BD" w:themeColor="accent1"/>
           <w:lang w:val="pt-BR"/>
         </w:rPr>
       </w:pPr>
       <w:r>
         <w:rPr>
-          <w:color w:val="AAB1B7"/>
-          <w:lang w:val="pt-BR"/>
-        </w:rPr>
-        <w:t>__________________________________________________________________________________</w:t>
+          <w:color w:val="4F81BD" w:themeColor="accent1"/>
+          <w:lang w:val="pt-BR"/>
+        </w:rPr>
+        <w:t>Find acha qualquer id que eu queira mas caso não tenha ele retorna undefined</w:t>
+      </w:r>
+      <w:r>
+        <w:rPr>
+          <w:color w:val="4F81BD" w:themeColor="accent1"/>
+          <w:lang w:val="pt-BR"/>
+        </w:rPr>
+        <w:t xml:space="preserve">, já o filter ele filtra com qualquer barreira </w:t>
+      </w:r>
+      <w:r>
+        <w:rPr>
+          <w:color w:val="4F81BD" w:themeColor="accent1"/>
+          <w:lang w:val="pt-BR"/>
+        </w:rPr>
+        <w:t>que eu definir</w:t>
       </w:r>
     </w:p>
     <w:p>
       <w:pPr>
         <w:rPr>
+          <w:b/>
           <w:lang w:val="pt-BR"/>
         </w:rPr>
       </w:pPr>
       <w:r>
         <w:rPr>
-          <w:color w:val="AAB1B7"/>
-          <w:lang w:val="pt-BR"/>
-        </w:rPr>
-        <w:t>__________________________________________________________________________________</w:t>
+          <w:b/>
+          <w:lang w:val="pt-BR"/>
+        </w:rPr>
+        <w:t>13. O que find() retorna quando o ID procurado não existe? E filter() quando nenhum elemento atende à condição?</w:t>
       </w:r>
     </w:p>
     <w:p>
       <w:pPr>
         <w:rPr>
+          <w:color w:val="4F81BD" w:themeColor="accent1"/>
           <w:lang w:val="pt-BR"/>
         </w:rPr>
       </w:pPr>
       <w:r>
         <w:rPr>
           <w:b/>
-          <w:lang w:val="pt-BR"/>
-        </w:rPr>
-        <w:t xml:space="preserve">13. O que </w:t>
+          <w:color w:val="4F81BD" w:themeColor="accent1"/>
+          <w:lang w:val="pt-BR"/>
+        </w:rPr>
+        <w:t>U</w:t>
       </w:r>
-      <w:proofErr w:type="spellStart"/>
-      <w:proofErr w:type="gramStart"/>
       <w:r>
         <w:rPr>
           <w:b/>
-          <w:lang w:val="pt-BR"/>
-        </w:rPr>
-        <w:t>find</w:t>
+          <w:color w:val="4F81BD" w:themeColor="accent1"/>
+          <w:lang w:val="pt-BR"/>
+        </w:rPr>
+        <w:t>ndefine</w:t>
       </w:r>
-      <w:proofErr w:type="spellEnd"/>
       <w:r>
         <w:rPr>
           <w:b/>
-          <w:lang w:val="pt-BR"/>
-        </w:rPr>
-        <w:t>(</w:t>
-      </w:r>
-      <w:proofErr w:type="gramEnd"/>
-      <w:r>
-        <w:rPr>
-          <w:b/>
-          <w:lang w:val="pt-BR"/>
-        </w:rPr>
-        <w:t xml:space="preserve">) retorna quando o ID procurado não existe? E </w:t>
-      </w:r>
-      <w:proofErr w:type="spellStart"/>
-      <w:proofErr w:type="gramStart"/>
-      <w:r>
-        <w:rPr>
-          <w:b/>
-          <w:lang w:val="pt-BR"/>
-        </w:rPr>
-        <w:t>filter</w:t>
-      </w:r>
-      <w:proofErr w:type="spellEnd"/>
-      <w:r>
-        <w:rPr>
-          <w:b/>
-          <w:lang w:val="pt-BR"/>
-        </w:rPr>
-        <w:t>(</w:t>
-      </w:r>
-      <w:proofErr w:type="gramEnd"/>
-      <w:r>
-        <w:rPr>
-          <w:b/>
-          <w:lang w:val="pt-BR"/>
-        </w:rPr>
-        <w:t>) quando nenhum elemento atende à condição?</w:t>
+          <w:color w:val="4F81BD" w:themeColor="accent1"/>
+          <w:lang w:val="pt-BR"/>
+        </w:rPr>
+        <w:t>d, []</w:t>
       </w:r>
     </w:p>
     <w:p>
       <w:pPr>
         <w:rPr>
-          <w:lang w:val="pt-BR"/>
-        </w:rPr>
-      </w:pPr>
-      <w:r>
-        <w:rPr>
-          <w:color w:val="AAB1B7"/>
-          <w:lang w:val="pt-BR"/>
-        </w:rPr>
-        <w:t>__________________________________________________________________________________</w:t>
-      </w:r>
-    </w:p>
-    <w:p>
-      <w:pPr>
-        <w:rPr>
-          <w:lang w:val="pt-BR"/>
-        </w:rPr>
-      </w:pPr>
-      <w:r>
-        <w:rPr>
-          <w:color w:val="AAB1B7"/>
-          <w:lang w:val="pt-BR"/>
-        </w:rPr>
-        <w:t>__________________________________________________________________________________</w:t>
-      </w:r>
-    </w:p>
-    <w:p>
-      <w:pPr>
-        <w:rPr>
+          <w:b/>
           <w:lang w:val="pt-BR"/>
         </w:rPr>
       </w:pPr>
@@ -1933,29 +1204,17 @@
     <w:p>
       <w:pPr>
         <w:rPr>
+          <w:color w:val="4F81BD" w:themeColor="accent1"/>
           <w:lang w:val="pt-BR"/>
         </w:rPr>
       </w:pPr>
       <w:r>
         <w:rPr>
-          <w:color w:val="AAB1B7"/>
-          <w:lang w:val="pt-BR"/>
-        </w:rPr>
-        <w:t>__________________________________________________________________________________</w:t>
-      </w:r>
-    </w:p>
-    <w:p>
-      <w:pPr>
-        <w:rPr>
-          <w:lang w:val="pt-BR"/>
-        </w:rPr>
-      </w:pPr>
-      <w:r>
-        <w:rPr>
-          <w:color w:val="AAB1B7"/>
-          <w:lang w:val="pt-BR"/>
-        </w:rPr>
-        <w:t>__________________________________________________________________________________</w:t>
+          <w:b/>
+          <w:color w:val="4F81BD" w:themeColor="accent1"/>
+          <w:lang w:val="pt-BR"/>
+        </w:rPr>
+        <w:t>Porque 3 numero é diferente de “3” em sting.</w:t>
       </w:r>
     </w:p>
     <w:p>
@@ -1974,30 +1233,32 @@
     </w:p>
     <w:p>
       <w:pPr>
-        <w:rPr>
+        <w:pStyle w:val="Ttulo2"/>
+        <w:rPr>
+          <w:color w:val="4F81BD" w:themeColor="accent1"/>
           <w:lang w:val="pt-BR"/>
         </w:rPr>
       </w:pPr>
       <w:r>
         <w:rPr>
-          <w:color w:val="AAB1B7"/>
-          <w:lang w:val="pt-BR"/>
-        </w:rPr>
-        <w:t>__________________________________________________________________________________</w:t>
+          <w:color w:val="4F81BD" w:themeColor="accent1"/>
+          <w:lang w:val="pt-BR"/>
+        </w:rPr>
+        <w:t xml:space="preserve">Deve ter um try </w:t>
       </w:r>
-    </w:p>
-    <w:p>
-      <w:pPr>
-        <w:rPr>
-          <w:lang w:val="pt-BR"/>
-        </w:rPr>
-      </w:pPr>
       <w:r>
         <w:rPr>
-          <w:color w:val="AAB1B7"/>
-          <w:lang w:val="pt-BR"/>
-        </w:rPr>
-        <w:t>__________________________________________________________________________________</w:t>
+          <w:color w:val="4F81BD" w:themeColor="accent1"/>
+          <w:lang w:val="pt-BR"/>
+        </w:rPr>
+        <w:t xml:space="preserve">para explicar ao usuário o “erro” encontrado </w:t>
+      </w:r>
+      <w:r>
+        <w:rPr>
+          <w:color w:val="4F81BD" w:themeColor="accent1"/>
+          <w:lang w:val="pt-BR"/>
+        </w:rPr>
+        <w:t>que no caso é não encontrar uma maquina</w:t>
       </w:r>
     </w:p>
     <w:p>
@@ -2024,23 +1285,7 @@
         <w:rPr>
           <w:lang w:val="pt-BR"/>
         </w:rPr>
-        <w:t xml:space="preserve">Execute cada caso e registre a saída obtida. Quando possível, use os nomes e valores exatos de </w:t>
-      </w:r>
-      <w:proofErr w:type="spellStart"/>
-      <w:proofErr w:type="gramStart"/>
-      <w:r>
-        <w:rPr>
-          <w:lang w:val="pt-BR"/>
-        </w:rPr>
-        <w:t>maquinas.json</w:t>
-      </w:r>
-      <w:proofErr w:type="spellEnd"/>
-      <w:proofErr w:type="gramEnd"/>
-      <w:r>
-        <w:rPr>
-          <w:lang w:val="pt-BR"/>
-        </w:rPr>
-        <w:t>.</w:t>
+        <w:t>Execute cada caso e registre a saída obtida. Quando possível, use os nomes e valores exatos de maquinas.json.</w:t>
       </w:r>
     </w:p>
     <w:tbl>
@@ -2108,7 +1353,6 @@
           </w:tcPr>
           <w:p>
             <w:r>
-              <w:lastRenderedPageBreak/>
               <w:t>carregarMaquinas()</w:t>
             </w:r>
           </w:p>
@@ -2135,7 +1379,13 @@
               <w:cnfStyle w:val="000000100000" w:firstRow="0" w:lastRow="0" w:firstColumn="0" w:lastColumn="0" w:oddVBand="0" w:evenVBand="0" w:oddHBand="1" w:evenHBand="0" w:firstRowFirstColumn="0" w:firstRowLastColumn="0" w:lastRowFirstColumn="0" w:lastRowLastColumn="0"/>
             </w:pPr>
             <w:r>
-              <w:t>[PREENCHER]</w:t>
+              <w:t>[</w:t>
+            </w:r>
+            <w:r>
+              <w:t>ok</w:t>
+            </w:r>
+            <w:r>
+              <w:t>]</w:t>
             </w:r>
           </w:p>
         </w:tc>
@@ -2174,7 +1424,13 @@
               <w:cnfStyle w:val="000000000000" w:firstRow="0" w:lastRow="0" w:firstColumn="0" w:lastColumn="0" w:oddVBand="0" w:evenVBand="0" w:oddHBand="0" w:evenHBand="0" w:firstRowFirstColumn="0" w:firstRowLastColumn="0" w:lastRowFirstColumn="0" w:lastRowLastColumn="0"/>
             </w:pPr>
             <w:r>
-              <w:t>[PREENCHER]</w:t>
+              <w:t>[</w:t>
+            </w:r>
+            <w:r>
+              <w:t>ok</w:t>
+            </w:r>
+            <w:r>
+              <w:t>]</w:t>
             </w:r>
           </w:p>
         </w:tc>
@@ -2216,7 +1472,13 @@
               <w:cnfStyle w:val="000000100000" w:firstRow="0" w:lastRow="0" w:firstColumn="0" w:lastColumn="0" w:oddVBand="0" w:evenVBand="0" w:oddHBand="1" w:evenHBand="0" w:firstRowFirstColumn="0" w:firstRowLastColumn="0" w:lastRowFirstColumn="0" w:lastRowLastColumn="0"/>
             </w:pPr>
             <w:r>
-              <w:t>[PREENCHER]</w:t>
+              <w:t>[</w:t>
+            </w:r>
+            <w:r>
+              <w:t>ok</w:t>
+            </w:r>
+            <w:r>
+              <w:t>]</w:t>
             </w:r>
           </w:p>
         </w:tc>
@@ -2229,6 +1491,7 @@
           </w:tcPr>
           <w:p>
             <w:r>
+              <w:lastRenderedPageBreak/>
               <w:t>filtrarPorStatus(..., "manutencao")</w:t>
             </w:r>
           </w:p>
@@ -2255,7 +1518,13 @@
               <w:cnfStyle w:val="000000000000" w:firstRow="0" w:lastRow="0" w:firstColumn="0" w:lastColumn="0" w:oddVBand="0" w:evenVBand="0" w:oddHBand="0" w:evenHBand="0" w:firstRowFirstColumn="0" w:firstRowLastColumn="0" w:lastRowFirstColumn="0" w:lastRowLastColumn="0"/>
             </w:pPr>
             <w:r>
-              <w:t>[PREENCHER]</w:t>
+              <w:t>[</w:t>
+            </w:r>
+            <w:r>
+              <w:t>ok</w:t>
+            </w:r>
+            <w:r>
+              <w:t>]</w:t>
             </w:r>
           </w:p>
         </w:tc>
@@ -2297,7 +1566,13 @@
               <w:cnfStyle w:val="000000100000" w:firstRow="0" w:lastRow="0" w:firstColumn="0" w:lastColumn="0" w:oddVBand="0" w:evenVBand="0" w:oddHBand="1" w:evenHBand="0" w:firstRowFirstColumn="0" w:firstRowLastColumn="0" w:lastRowFirstColumn="0" w:lastRowLastColumn="0"/>
             </w:pPr>
             <w:r>
-              <w:t>[PREENCHER]</w:t>
+              <w:t>[</w:t>
+            </w:r>
+            <w:r>
+              <w:t>ok</w:t>
+            </w:r>
+            <w:r>
+              <w:t>]</w:t>
             </w:r>
           </w:p>
         </w:tc>
@@ -2336,7 +1611,13 @@
               <w:cnfStyle w:val="000000000000" w:firstRow="0" w:lastRow="0" w:firstColumn="0" w:lastColumn="0" w:oddVBand="0" w:evenVBand="0" w:oddHBand="0" w:evenHBand="0" w:firstRowFirstColumn="0" w:firstRowLastColumn="0" w:lastRowFirstColumn="0" w:lastRowLastColumn="0"/>
             </w:pPr>
             <w:r>
-              <w:t>[PREENCHER]</w:t>
+              <w:t>[</w:t>
+            </w:r>
+            <w:r>
+              <w:t>ok</w:t>
+            </w:r>
+            <w:r>
+              <w:t>]</w:t>
             </w:r>
           </w:p>
         </w:tc>
@@ -2378,7 +1659,13 @@
               <w:cnfStyle w:val="000000100000" w:firstRow="0" w:lastRow="0" w:firstColumn="0" w:lastColumn="0" w:oddVBand="0" w:evenVBand="0" w:oddHBand="1" w:evenHBand="0" w:firstRowFirstColumn="0" w:firstRowLastColumn="0" w:lastRowFirstColumn="0" w:lastRowLastColumn="0"/>
             </w:pPr>
             <w:r>
-              <w:t>[PREENCHER]</w:t>
+              <w:t>[</w:t>
+            </w:r>
+            <w:r>
+              <w:t>ok</w:t>
+            </w:r>
+            <w:r>
+              <w:t>]</w:t>
             </w:r>
           </w:p>
         </w:tc>
@@ -2460,6 +1747,46 @@
               </w:rPr>
               <w:t xml:space="preserve"> </w:t>
             </w:r>
+            <w:r>
+              <w:rPr>
+                <w:lang w:val="pt-BR"/>
+              </w:rPr>
+              <w:drawing>
+                <wp:inline distT="0" distB="0" distL="0" distR="0" wp14:anchorId="490195CB" wp14:editId="5CDC6144">
+                  <wp:extent cx="1667108" cy="1733792"/>
+                  <wp:effectExtent l="0" t="0" r="9525" b="0"/>
+                  <wp:docPr id="950174265" name="Imagem 1"/>
+                  <wp:cNvGraphicFramePr>
+                    <a:graphicFrameLocks xmlns:a="http://schemas.openxmlformats.org/drawingml/2006/main" noChangeAspect="1"/>
+                  </wp:cNvGraphicFramePr>
+                  <a:graphic xmlns:a="http://schemas.openxmlformats.org/drawingml/2006/main">
+                    <a:graphicData uri="http://schemas.openxmlformats.org/drawingml/2006/picture">
+                      <pic:pic xmlns:pic="http://schemas.openxmlformats.org/drawingml/2006/picture">
+                        <pic:nvPicPr>
+                          <pic:cNvPr id="950174265" name=""/>
+                          <pic:cNvPicPr/>
+                        </pic:nvPicPr>
+                        <pic:blipFill>
+                          <a:blip r:embed="rId9"/>
+                          <a:stretch>
+                            <a:fillRect/>
+                          </a:stretch>
+                        </pic:blipFill>
+                        <pic:spPr>
+                          <a:xfrm>
+                            <a:off x="0" y="0"/>
+                            <a:ext cx="1667108" cy="1733792"/>
+                          </a:xfrm>
+                          <a:prstGeom prst="rect">
+                            <a:avLst/>
+                          </a:prstGeom>
+                        </pic:spPr>
+                      </pic:pic>
+                    </a:graphicData>
+                  </a:graphic>
+                </wp:inline>
+              </w:drawing>
+            </w:r>
           </w:p>
           <w:p>
             <w:pPr>
@@ -2544,6 +1871,46 @@
               </w:rPr>
               <w:t xml:space="preserve"> </w:t>
             </w:r>
+            <w:r>
+              <w:rPr>
+                <w:lang w:val="pt-BR"/>
+              </w:rPr>
+              <w:drawing>
+                <wp:inline distT="0" distB="0" distL="0" distR="0" wp14:anchorId="4864DBC2" wp14:editId="604F8940">
+                  <wp:extent cx="2314898" cy="2838846"/>
+                  <wp:effectExtent l="0" t="0" r="9525" b="0"/>
+                  <wp:docPr id="1063535118" name="Imagem 1"/>
+                  <wp:cNvGraphicFramePr>
+                    <a:graphicFrameLocks xmlns:a="http://schemas.openxmlformats.org/drawingml/2006/main" noChangeAspect="1"/>
+                  </wp:cNvGraphicFramePr>
+                  <a:graphic xmlns:a="http://schemas.openxmlformats.org/drawingml/2006/main">
+                    <a:graphicData uri="http://schemas.openxmlformats.org/drawingml/2006/picture">
+                      <pic:pic xmlns:pic="http://schemas.openxmlformats.org/drawingml/2006/picture">
+                        <pic:nvPicPr>
+                          <pic:cNvPr id="1063535118" name=""/>
+                          <pic:cNvPicPr/>
+                        </pic:nvPicPr>
+                        <pic:blipFill>
+                          <a:blip r:embed="rId10"/>
+                          <a:stretch>
+                            <a:fillRect/>
+                          </a:stretch>
+                        </pic:blipFill>
+                        <pic:spPr>
+                          <a:xfrm>
+                            <a:off x="0" y="0"/>
+                            <a:ext cx="2314898" cy="2838846"/>
+                          </a:xfrm>
+                          <a:prstGeom prst="rect">
+                            <a:avLst/>
+                          </a:prstGeom>
+                        </pic:spPr>
+                      </pic:pic>
+                    </a:graphicData>
+                  </a:graphic>
+                </wp:inline>
+              </w:drawing>
+            </w:r>
           </w:p>
           <w:p>
             <w:pPr>
@@ -2577,6 +1944,7 @@
     <w:p>
       <w:pPr>
         <w:rPr>
+          <w:b/>
           <w:lang w:val="pt-BR"/>
         </w:rPr>
       </w:pPr>
@@ -2591,87 +1959,47 @@
     <w:p>
       <w:pPr>
         <w:rPr>
+          <w:color w:val="4F81BD" w:themeColor="accent1"/>
           <w:lang w:val="pt-BR"/>
         </w:rPr>
       </w:pPr>
       <w:r>
         <w:rPr>
-          <w:color w:val="AAB1B7"/>
-          <w:lang w:val="pt-BR"/>
-        </w:rPr>
-        <w:t>__________________________________________________________________________________</w:t>
+          <w:b/>
+          <w:color w:val="4F81BD" w:themeColor="accent1"/>
+          <w:lang w:val="pt-BR"/>
+        </w:rPr>
+        <w:t>Tive que adicionar um console.log para mostrar o filtro por setor</w:t>
       </w:r>
     </w:p>
     <w:p>
       <w:pPr>
         <w:rPr>
+          <w:b/>
           <w:lang w:val="pt-BR"/>
         </w:rPr>
       </w:pPr>
       <w:r>
         <w:rPr>
-          <w:color w:val="AAB1B7"/>
-          <w:lang w:val="pt-BR"/>
-        </w:rPr>
-        <w:t>__________________________________________________________________________________</w:t>
+          <w:b/>
+          <w:lang w:val="pt-BR"/>
+        </w:rPr>
+        <w:t>17. Explique por que a operação READ é importante em sistemas Back-End reais.</w:t>
       </w:r>
     </w:p>
     <w:p>
       <w:pPr>
         <w:rPr>
+          <w:color w:val="1F497D" w:themeColor="text2"/>
           <w:lang w:val="pt-BR"/>
         </w:rPr>
       </w:pPr>
       <w:r>
         <w:rPr>
-          <w:b/>
-          <w:lang w:val="pt-BR"/>
-        </w:rPr>
-        <w:t>17. Explique por que a operação READ é importante em sistemas Back-</w:t>
-      </w:r>
-      <w:proofErr w:type="spellStart"/>
-      <w:r>
-        <w:rPr>
-          <w:b/>
-          <w:lang w:val="pt-BR"/>
-        </w:rPr>
-        <w:t>End</w:t>
-      </w:r>
-      <w:proofErr w:type="spellEnd"/>
-      <w:r>
-        <w:rPr>
-          <w:b/>
-          <w:lang w:val="pt-BR"/>
-        </w:rPr>
-        <w:t xml:space="preserve"> reais.</w:t>
-      </w:r>
-    </w:p>
-    <w:p>
-      <w:pPr>
-        <w:rPr>
-          <w:lang w:val="pt-BR"/>
-        </w:rPr>
-      </w:pPr>
-      <w:r>
-        <w:rPr>
-          <w:color w:val="AAB1B7"/>
-          <w:lang w:val="pt-BR"/>
-        </w:rPr>
-        <w:t>__________________________________________________________________________________</w:t>
-      </w:r>
-    </w:p>
-    <w:p>
-      <w:pPr>
-        <w:rPr>
-          <w:lang w:val="pt-BR"/>
-        </w:rPr>
-      </w:pPr>
-      <w:r>
-        <w:rPr>
-          <w:color w:val="AAB1B7"/>
-          <w:lang w:val="pt-BR"/>
-        </w:rPr>
-        <w:t>__________________________________________________________________________________</w:t>
+          <w:color w:val="1F497D" w:themeColor="text2"/>
+          <w:lang w:val="pt-BR"/>
+        </w:rPr>
+        <w:t>Consegue facilitar o trabalho humano de busca por um método mais eficiente</w:t>
       </w:r>
     </w:p>
     <w:p>
@@ -2707,35 +2035,23 @@
           <w:lang w:val="pt-BR"/>
         </w:rPr>
       </w:pPr>
-      <w:proofErr w:type="gramStart"/>
       <w:r>
         <w:rPr>
           <w:lang w:val="pt-BR"/>
         </w:rPr>
-        <w:t>[  ]</w:t>
+        <w:t>[</w:t>
       </w:r>
-      <w:proofErr w:type="gramEnd"/>
       <w:r>
         <w:rPr>
           <w:lang w:val="pt-BR"/>
         </w:rPr>
-        <w:t xml:space="preserve"> Li e converti </w:t>
+        <w:t>x</w:t>
       </w:r>
-      <w:proofErr w:type="spellStart"/>
-      <w:proofErr w:type="gramStart"/>
       <w:r>
         <w:rPr>
           <w:lang w:val="pt-BR"/>
         </w:rPr>
-        <w:t>maquinas.json</w:t>
-      </w:r>
-      <w:proofErr w:type="spellEnd"/>
-      <w:proofErr w:type="gramEnd"/>
-      <w:r>
-        <w:rPr>
-          <w:lang w:val="pt-BR"/>
-        </w:rPr>
-        <w:t xml:space="preserve"> sem alterar os dados originais.</w:t>
+        <w:t>] Li e converti maquinas.json sem alterar os dados originais.</w:t>
       </w:r>
     </w:p>
     <w:p>
@@ -2744,14 +2060,25 @@
           <w:lang w:val="pt-BR"/>
         </w:rPr>
       </w:pPr>
-      <w:proofErr w:type="gramStart"/>
       <w:r>
         <w:rPr>
           <w:lang w:val="pt-BR"/>
         </w:rPr>
-        <w:t>[  ]</w:t>
+        <w:lastRenderedPageBreak/>
+        <w:t>[</w:t>
       </w:r>
-      <w:proofErr w:type="gramEnd"/>
+      <w:r>
+        <w:rPr>
+          <w:lang w:val="pt-BR"/>
+        </w:rPr>
+        <w:t>x</w:t>
+      </w:r>
+      <w:r>
+        <w:rPr>
+          <w:lang w:val="pt-BR"/>
+        </w:rPr>
+        <w:t xml:space="preserve"> ]</w:t>
+      </w:r>
       <w:r>
         <w:rPr>
           <w:lang w:val="pt-BR"/>
@@ -2765,14 +2092,24 @@
           <w:lang w:val="pt-BR"/>
         </w:rPr>
       </w:pPr>
-      <w:proofErr w:type="gramStart"/>
       <w:r>
         <w:rPr>
           <w:lang w:val="pt-BR"/>
         </w:rPr>
-        <w:t>[  ]</w:t>
+        <w:t>[</w:t>
       </w:r>
-      <w:proofErr w:type="gramEnd"/>
+      <w:r>
+        <w:rPr>
+          <w:lang w:val="pt-BR"/>
+        </w:rPr>
+        <w:t>x</w:t>
+      </w:r>
+      <w:r>
+        <w:rPr>
+          <w:lang w:val="pt-BR"/>
+        </w:rPr>
+        <w:t xml:space="preserve"> ]</w:t>
+      </w:r>
       <w:r>
         <w:rPr>
           <w:lang w:val="pt-BR"/>
@@ -2786,14 +2123,24 @@
           <w:lang w:val="pt-BR"/>
         </w:rPr>
       </w:pPr>
-      <w:proofErr w:type="gramStart"/>
       <w:r>
         <w:rPr>
           <w:lang w:val="pt-BR"/>
         </w:rPr>
-        <w:t>[  ]</w:t>
+        <w:t>[</w:t>
       </w:r>
-      <w:proofErr w:type="gramEnd"/>
+      <w:r>
+        <w:rPr>
+          <w:lang w:val="pt-BR"/>
+        </w:rPr>
+        <w:t>x</w:t>
+      </w:r>
+      <w:r>
+        <w:rPr>
+          <w:lang w:val="pt-BR"/>
+        </w:rPr>
+        <w:t xml:space="preserve"> ]</w:t>
+      </w:r>
       <w:r>
         <w:rPr>
           <w:lang w:val="pt-BR"/>
@@ -2807,47 +2154,29 @@
           <w:lang w:val="pt-BR"/>
         </w:rPr>
       </w:pPr>
-      <w:proofErr w:type="gramStart"/>
       <w:r>
         <w:rPr>
           <w:lang w:val="pt-BR"/>
         </w:rPr>
-        <w:t>[  ]</w:t>
+        <w:t>[</w:t>
       </w:r>
-      <w:proofErr w:type="gramEnd"/>
       <w:r>
         <w:rPr>
           <w:lang w:val="pt-BR"/>
         </w:rPr>
-        <w:t xml:space="preserve"> Executei os testes disponíveis no projeto (</w:t>
+        <w:t>x</w:t>
       </w:r>
-      <w:proofErr w:type="spellStart"/>
       <w:r>
         <w:rPr>
           <w:lang w:val="pt-BR"/>
         </w:rPr>
-        <w:t>npm</w:t>
+        <w:t>]</w:t>
       </w:r>
-      <w:proofErr w:type="spellEnd"/>
       <w:r>
         <w:rPr>
           <w:lang w:val="pt-BR"/>
         </w:rPr>
-        <w:t xml:space="preserve"> </w:t>
-      </w:r>
-      <w:proofErr w:type="spellStart"/>
-      <w:r>
-        <w:rPr>
-          <w:lang w:val="pt-BR"/>
-        </w:rPr>
-        <w:t>test</w:t>
-      </w:r>
-      <w:proofErr w:type="spellEnd"/>
-      <w:r>
-        <w:rPr>
-          <w:lang w:val="pt-BR"/>
-        </w:rPr>
-        <w:t>).</w:t>
+        <w:t xml:space="preserve"> Executei os testes disponíveis no projeto (npm test).</w:t>
       </w:r>
     </w:p>
     <w:p>
@@ -2856,14 +2185,24 @@
           <w:lang w:val="pt-BR"/>
         </w:rPr>
       </w:pPr>
-      <w:proofErr w:type="gramStart"/>
       <w:r>
         <w:rPr>
           <w:lang w:val="pt-BR"/>
         </w:rPr>
-        <w:t>[  ]</w:t>
+        <w:t>[</w:t>
       </w:r>
-      <w:proofErr w:type="gramEnd"/>
+      <w:r>
+        <w:rPr>
+          <w:lang w:val="pt-BR"/>
+        </w:rPr>
+        <w:t>x</w:t>
+      </w:r>
+      <w:r>
+        <w:rPr>
+          <w:lang w:val="pt-BR"/>
+        </w:rPr>
+        <w:t>]</w:t>
+      </w:r>
       <w:r>
         <w:rPr>
           <w:lang w:val="pt-BR"/>
@@ -2877,14 +2216,12 @@
           <w:lang w:val="pt-BR"/>
         </w:rPr>
       </w:pPr>
-      <w:proofErr w:type="gramStart"/>
       <w:r>
         <w:rPr>
           <w:lang w:val="pt-BR"/>
         </w:rPr>
-        <w:t>[  ]</w:t>
+        <w:t>[ ]</w:t>
       </w:r>
-      <w:proofErr w:type="gramEnd"/>
       <w:r>
         <w:rPr>
           <w:lang w:val="pt-BR"/>
@@ -2907,28 +2244,27 @@
     </w:p>
     <w:p>
       <w:r>
-        <w:t>Data: __</w:t>
+        <w:t xml:space="preserve">Data: </w:t>
       </w:r>
-      <w:proofErr w:type="gramStart"/>
       <w:r>
-        <w:t>__/</w:t>
+        <w:t>27</w:t>
       </w:r>
-      <w:proofErr w:type="gramEnd"/>
       <w:r>
-        <w:t xml:space="preserve">____/2026      </w:t>
+        <w:t>/</w:t>
       </w:r>
-      <w:proofErr w:type="spellStart"/>
       <w:r>
-        <w:t>Aluno</w:t>
+        <w:t>10</w:t>
       </w:r>
-      <w:proofErr w:type="spellEnd"/>
       <w:r>
-        <w:t>(a): __________________________________________</w:t>
+        <w:t xml:space="preserve">/2026      Aluno(a): </w:t>
+      </w:r>
+      <w:r>
+        <w:t>Gabriel Lúcio</w:t>
       </w:r>
     </w:p>
     <w:sectPr>
-      <w:headerReference w:type="default" r:id="rId9"/>
-      <w:footerReference w:type="default" r:id="rId10"/>
+      <w:headerReference w:type="default" r:id="rId11"/>
+      <w:footerReference w:type="default" r:id="rId12"/>
       <w:pgSz w:w="12240" w:h="15840"/>
       <w:pgMar w:top="1020" w:right="1191" w:bottom="964" w:left="1276" w:header="720" w:footer="720" w:gutter="0"/>
       <w:cols w:space="720"/>
@@ -3840,6 +3176,7 @@
   <w:style w:type="character" w:default="1" w:styleId="Fontepargpadro">
     <w:name w:val="Default Paragraph Font"/>
     <w:uiPriority w:val="1"/>
+    <w:semiHidden/>
     <w:unhideWhenUsed/>
   </w:style>
   <w:style w:type="table" w:default="1" w:styleId="Tabelanormal">

</xml_diff>